<commit_message>
docs(구매): OAK-1 PoE 주문 옵션 표 — FIXED-FOCUS 선택, AUTO/32MP/US Cord 인젝터 제외 근거 (워드 + md)
Co-Authored-By: Claude Fable 5.1 <noreply@anthropic.com>
</commit_message>
<xml_diff>
--- a/docs/전달용/SSF2026_구매목록_계통별.docx
+++ b/docs/전달용/SSF2026_구매목록_계통별.docx
@@ -1395,7 +1395,7 @@
                 <w:sz w:val="19"/>
                 <w:szCs w:val="19"/>
               </w:rPr>
-              <w:t xml:space="preserve">[지원금 들어옴] 자율운항 비전 카메라. 마스트 꼭대기에서 부표·표식 인식. 옵션: 32MP·US Cord 인젝터 선택 금지</w:t>
+              <w:t xml:space="preserve">[지원금 들어옴] 자율운항 비전 카메라. 마스트 꼭대기에서 부표·표식 인식. 주문 후 수입 상품(통관부호 필요) — 납기 먼저 문의</w:t>
             </w:r>
           </w:p>
         </w:tc>
@@ -1509,7 +1509,7 @@
             </w:tcMar>
           </w:tcPr>
           <w:p>
-            <w:hyperlink w:history="1" r:id="rIdjzlx6xpgkt58linomsvfx">
+            <w:hyperlink w:history="1" r:id="rIdhqnbomkrvmd_1i1sx9mxb">
               <w:r>
                 <w:rPr>
                   <w:rStyle w:val="Hyperlink"/>
@@ -1692,7 +1692,7 @@
             </w:tcMar>
           </w:tcPr>
           <w:p>
-            <w:hyperlink w:history="1" r:id="rIdicjromrnhpeupny3c7jck">
+            <w:hyperlink w:history="1" r:id="rIdwhkhklzmowj_dhvaxq48c">
               <w:r>
                 <w:rPr>
                   <w:rStyle w:val="Hyperlink"/>
@@ -1875,7 +1875,7 @@
             </w:tcMar>
           </w:tcPr>
           <w:p>
-            <w:hyperlink w:history="1" r:id="rIdllig1_ljsnddlxm8uwxvn">
+            <w:hyperlink w:history="1" r:id="rIdzipp5tpefqooh8n2zbcre">
               <w:r>
                 <w:rPr>
                   <w:rStyle w:val="Hyperlink"/>
@@ -2058,7 +2058,7 @@
             </w:tcMar>
           </w:tcPr>
           <w:p>
-            <w:hyperlink w:history="1" r:id="rIdfuucaaeu4bymhqthtd-9b">
+            <w:hyperlink w:history="1" r:id="rIdrwgvd6_orl_oj0pqmckvs">
               <w:r>
                 <w:rPr>
                   <w:rStyle w:val="Hyperlink"/>
@@ -2079,7 +2079,7 @@
               </w:rPr>
               <w:t xml:space="preserve"> · </w:t>
             </w:r>
-            <w:hyperlink w:history="1" r:id="rIdc81wfy8s2e8tnfbrmfpyr">
+            <w:hyperlink w:history="1" r:id="rId5s_nb1wrhygfhz8bilqtk">
               <w:r>
                 <w:rPr>
                   <w:rStyle w:val="Hyperlink"/>
@@ -2268,6 +2268,709 @@
                 <w:szCs w:val="19"/>
               </w:rPr>
               <w:t xml:space="preserve"/>
+            </w:r>
+          </w:p>
+        </w:tc>
+      </w:tr>
+    </w:tbl>
+    <w:p>
+      <w:pPr>
+        <w:spacing w:after="80" w:before="80"/>
+      </w:pPr>
+      <w:r>
+        <w:rPr>
+          <w:rFonts w:ascii="Malgun Gothic" w:cs="Malgun Gothic" w:eastAsia="Malgun Gothic" w:hAnsi="Malgun Gothic"/>
+          <w:b/>
+          <w:bCs/>
+          <w:sz w:val="19"/>
+          <w:szCs w:val="19"/>
+        </w:rPr>
+        <w:t xml:space="preserve">OAK-1 PoE 주문 옵션 (리얼리스토어 페이지 10-14 확인)</w:t>
+      </w:r>
+    </w:p>
+    <w:tbl>
+      <w:tblPr>
+        <w:tblW w:type="dxa" w:w="14570"/>
+        <w:tblBorders>
+          <w:top w:val="single" w:color="auto" w:sz="4"/>
+          <w:left w:val="single" w:color="auto" w:sz="4"/>
+          <w:bottom w:val="single" w:color="auto" w:sz="4"/>
+          <w:right w:val="single" w:color="auto" w:sz="4"/>
+          <w:insideH w:val="single" w:color="auto" w:sz="4"/>
+          <w:insideV w:val="single" w:color="auto" w:sz="4"/>
+        </w:tblBorders>
+      </w:tblPr>
+      <w:tblGrid>
+        <w:gridCol w:w="2600"/>
+        <w:gridCol w:w="4200"/>
+        <w:gridCol w:w="1400"/>
+        <w:gridCol w:w="6370"/>
+      </w:tblGrid>
+      <w:tr>
+        <w:trPr>
+          <w:tblHeader/>
+        </w:trPr>
+        <w:tc>
+          <w:tcPr>
+            <w:tcW w:type="dxa" w:w="2600"/>
+            <w:tcBorders>
+              <w:top w:val="single" w:color="A6A6A6" w:sz="4"/>
+              <w:left w:val="single" w:color="A6A6A6" w:sz="4"/>
+              <w:bottom w:val="single" w:color="A6A6A6" w:sz="4"/>
+              <w:right w:val="single" w:color="A6A6A6" w:sz="4"/>
+            </w:tcBorders>
+            <w:shd w:fill="1F3864" w:color="auto" w:val="clear"/>
+            <w:tcMar>
+              <w:top w:type="dxa" w:w="60"/>
+              <w:left w:type="dxa" w:w="100"/>
+              <w:bottom w:type="dxa" w:w="60"/>
+              <w:right w:type="dxa" w:w="100"/>
+            </w:tcMar>
+          </w:tcPr>
+          <w:p>
+            <w:r>
+              <w:rPr>
+                <w:rFonts w:ascii="Malgun Gothic" w:cs="Malgun Gothic" w:eastAsia="Malgun Gothic" w:hAnsi="Malgun Gothic"/>
+                <w:b/>
+                <w:bCs/>
+                <w:color w:val="FFFFFF"/>
+                <w:sz w:val="19"/>
+                <w:szCs w:val="19"/>
+              </w:rPr>
+              <w:t xml:space="preserve">옵션</w:t>
+            </w:r>
+          </w:p>
+        </w:tc>
+        <w:tc>
+          <w:tcPr>
+            <w:tcW w:type="dxa" w:w="4200"/>
+            <w:tcBorders>
+              <w:top w:val="single" w:color="A6A6A6" w:sz="4"/>
+              <w:left w:val="single" w:color="A6A6A6" w:sz="4"/>
+              <w:bottom w:val="single" w:color="A6A6A6" w:sz="4"/>
+              <w:right w:val="single" w:color="A6A6A6" w:sz="4"/>
+            </w:tcBorders>
+            <w:shd w:fill="1F3864" w:color="auto" w:val="clear"/>
+            <w:tcMar>
+              <w:top w:type="dxa" w:w="60"/>
+              <w:left w:type="dxa" w:w="100"/>
+              <w:bottom w:type="dxa" w:w="60"/>
+              <w:right w:type="dxa" w:w="100"/>
+            </w:tcMar>
+          </w:tcPr>
+          <w:p>
+            <w:r>
+              <w:rPr>
+                <w:rFonts w:ascii="Malgun Gothic" w:cs="Malgun Gothic" w:eastAsia="Malgun Gothic" w:hAnsi="Malgun Gothic"/>
+                <w:b/>
+                <w:bCs/>
+                <w:color w:val="FFFFFF"/>
+                <w:sz w:val="19"/>
+                <w:szCs w:val="19"/>
+              </w:rPr>
+              <w:t xml:space="preserve">선택지</w:t>
+            </w:r>
+          </w:p>
+        </w:tc>
+        <w:tc>
+          <w:tcPr>
+            <w:tcW w:type="dxa" w:w="1400"/>
+            <w:tcBorders>
+              <w:top w:val="single" w:color="A6A6A6" w:sz="4"/>
+              <w:left w:val="single" w:color="A6A6A6" w:sz="4"/>
+              <w:bottom w:val="single" w:color="A6A6A6" w:sz="4"/>
+              <w:right w:val="single" w:color="A6A6A6" w:sz="4"/>
+            </w:tcBorders>
+            <w:shd w:fill="1F3864" w:color="auto" w:val="clear"/>
+            <w:tcMar>
+              <w:top w:type="dxa" w:w="60"/>
+              <w:left w:type="dxa" w:w="100"/>
+              <w:bottom w:type="dxa" w:w="60"/>
+              <w:right w:type="dxa" w:w="100"/>
+            </w:tcMar>
+          </w:tcPr>
+          <w:p>
+            <w:r>
+              <w:rPr>
+                <w:rFonts w:ascii="Malgun Gothic" w:cs="Malgun Gothic" w:eastAsia="Malgun Gothic" w:hAnsi="Malgun Gothic"/>
+                <w:b/>
+                <w:bCs/>
+                <w:color w:val="FFFFFF"/>
+                <w:sz w:val="19"/>
+                <w:szCs w:val="19"/>
+              </w:rPr>
+              <w:t xml:space="preserve">결론</w:t>
+            </w:r>
+          </w:p>
+        </w:tc>
+        <w:tc>
+          <w:tcPr>
+            <w:tcW w:type="dxa" w:w="6370"/>
+            <w:tcBorders>
+              <w:top w:val="single" w:color="A6A6A6" w:sz="4"/>
+              <w:left w:val="single" w:color="A6A6A6" w:sz="4"/>
+              <w:bottom w:val="single" w:color="A6A6A6" w:sz="4"/>
+              <w:right w:val="single" w:color="A6A6A6" w:sz="4"/>
+            </w:tcBorders>
+            <w:shd w:fill="1F3864" w:color="auto" w:val="clear"/>
+            <w:tcMar>
+              <w:top w:type="dxa" w:w="60"/>
+              <w:left w:type="dxa" w:w="100"/>
+              <w:bottom w:type="dxa" w:w="60"/>
+              <w:right w:type="dxa" w:w="100"/>
+            </w:tcMar>
+          </w:tcPr>
+          <w:p>
+            <w:r>
+              <w:rPr>
+                <w:rFonts w:ascii="Malgun Gothic" w:cs="Malgun Gothic" w:eastAsia="Malgun Gothic" w:hAnsi="Malgun Gothic"/>
+                <w:b/>
+                <w:bCs/>
+                <w:color w:val="FFFFFF"/>
+                <w:sz w:val="19"/>
+                <w:szCs w:val="19"/>
+              </w:rPr>
+              <w:t xml:space="preserve">이유</w:t>
+            </w:r>
+          </w:p>
+        </w:tc>
+      </w:tr>
+      <w:tr>
+        <w:tc>
+          <w:tcPr>
+            <w:tcW w:type="dxa" w:w="2600"/>
+            <w:tcBorders>
+              <w:top w:val="single" w:color="A6A6A6" w:sz="4"/>
+              <w:left w:val="single" w:color="A6A6A6" w:sz="4"/>
+              <w:bottom w:val="single" w:color="A6A6A6" w:sz="4"/>
+              <w:right w:val="single" w:color="A6A6A6" w:sz="4"/>
+            </w:tcBorders>
+            <w:tcMar>
+              <w:top w:type="dxa" w:w="60"/>
+              <w:left w:type="dxa" w:w="100"/>
+              <w:bottom w:type="dxa" w:w="60"/>
+              <w:right w:type="dxa" w:w="100"/>
+            </w:tcMar>
+          </w:tcPr>
+          <w:p>
+            <w:pPr>
+              <w:jc w:val="left"/>
+            </w:pPr>
+            <w:r>
+              <w:rPr>
+                <w:rFonts w:ascii="Malgun Gothic" w:cs="Malgun Gothic" w:eastAsia="Malgun Gothic" w:hAnsi="Malgun Gothic"/>
+                <w:b w:val="false"/>
+                <w:bCs w:val="false"/>
+                <w:color w:val="000000"/>
+                <w:sz w:val="19"/>
+                <w:szCs w:val="19"/>
+              </w:rPr>
+              <w:t xml:space="preserve">Focus 선택</w:t>
+            </w:r>
+          </w:p>
+        </w:tc>
+        <w:tc>
+          <w:tcPr>
+            <w:tcW w:type="dxa" w:w="4200"/>
+            <w:tcBorders>
+              <w:top w:val="single" w:color="A6A6A6" w:sz="4"/>
+              <w:left w:val="single" w:color="A6A6A6" w:sz="4"/>
+              <w:bottom w:val="single" w:color="A6A6A6" w:sz="4"/>
+              <w:right w:val="single" w:color="A6A6A6" w:sz="4"/>
+            </w:tcBorders>
+            <w:tcMar>
+              <w:top w:type="dxa" w:w="60"/>
+              <w:left w:type="dxa" w:w="100"/>
+              <w:bottom w:type="dxa" w:w="60"/>
+              <w:right w:type="dxa" w:w="100"/>
+            </w:tcMar>
+          </w:tcPr>
+          <w:p>
+            <w:pPr>
+              <w:jc w:val="left"/>
+            </w:pPr>
+            <w:r>
+              <w:rPr>
+                <w:rFonts w:ascii="Malgun Gothic" w:cs="Malgun Gothic" w:eastAsia="Malgun Gothic" w:hAnsi="Malgun Gothic"/>
+                <w:b w:val="false"/>
+                <w:bCs w:val="false"/>
+                <w:color w:val="000000"/>
+                <w:sz w:val="19"/>
+                <w:szCs w:val="19"/>
+              </w:rPr>
+              <w:t xml:space="preserve">AUTO-FOCUS (A00124)</w:t>
+            </w:r>
+          </w:p>
+        </w:tc>
+        <w:tc>
+          <w:tcPr>
+            <w:tcW w:type="dxa" w:w="1400"/>
+            <w:tcBorders>
+              <w:top w:val="single" w:color="A6A6A6" w:sz="4"/>
+              <w:left w:val="single" w:color="A6A6A6" w:sz="4"/>
+              <w:bottom w:val="single" w:color="A6A6A6" w:sz="4"/>
+              <w:right w:val="single" w:color="A6A6A6" w:sz="4"/>
+            </w:tcBorders>
+            <w:tcMar>
+              <w:top w:type="dxa" w:w="60"/>
+              <w:left w:type="dxa" w:w="100"/>
+              <w:bottom w:type="dxa" w:w="60"/>
+              <w:right w:type="dxa" w:w="100"/>
+            </w:tcMar>
+          </w:tcPr>
+          <w:p>
+            <w:pPr>
+              <w:jc w:val="center"/>
+            </w:pPr>
+            <w:r>
+              <w:rPr>
+                <w:rFonts w:ascii="Malgun Gothic" w:cs="Malgun Gothic" w:eastAsia="Malgun Gothic" w:hAnsi="Malgun Gothic"/>
+                <w:b/>
+                <w:bCs/>
+                <w:color w:val="C00000"/>
+                <w:sz w:val="19"/>
+                <w:szCs w:val="19"/>
+              </w:rPr>
+              <w:t xml:space="preserve">✗</w:t>
+            </w:r>
+          </w:p>
+        </w:tc>
+        <w:tc>
+          <w:tcPr>
+            <w:tcW w:type="dxa" w:w="6370"/>
+            <w:tcBorders>
+              <w:top w:val="single" w:color="A6A6A6" w:sz="4"/>
+              <w:left w:val="single" w:color="A6A6A6" w:sz="4"/>
+              <w:bottom w:val="single" w:color="A6A6A6" w:sz="4"/>
+              <w:right w:val="single" w:color="A6A6A6" w:sz="4"/>
+            </w:tcBorders>
+            <w:tcMar>
+              <w:top w:type="dxa" w:w="60"/>
+              <w:left w:type="dxa" w:w="100"/>
+              <w:bottom w:type="dxa" w:w="60"/>
+              <w:right w:type="dxa" w:w="100"/>
+            </w:tcMar>
+          </w:tcPr>
+          <w:p>
+            <w:pPr>
+              <w:jc w:val="left"/>
+            </w:pPr>
+            <w:r>
+              <w:rPr>
+                <w:rFonts w:ascii="Malgun Gothic" w:cs="Malgun Gothic" w:eastAsia="Malgun Gothic" w:hAnsi="Malgun Gothic"/>
+                <w:b w:val="false"/>
+                <w:bCs w:val="false"/>
+                <w:color w:val="000000"/>
+                <w:sz w:val="19"/>
+                <w:szCs w:val="19"/>
+              </w:rPr>
+              <w:t xml:space="preserve">렌즈가 전자석으로 움직인다. 배 진동·파도에 초점이 흔들린다. 제조사도 진동 환경엔 고정초점 권장</w:t>
+            </w:r>
+          </w:p>
+        </w:tc>
+      </w:tr>
+      <w:tr>
+        <w:tc>
+          <w:tcPr>
+            <w:tcW w:type="dxa" w:w="2600"/>
+            <w:tcBorders>
+              <w:top w:val="single" w:color="A6A6A6" w:sz="4"/>
+              <w:left w:val="single" w:color="A6A6A6" w:sz="4"/>
+              <w:bottom w:val="single" w:color="A6A6A6" w:sz="4"/>
+              <w:right w:val="single" w:color="A6A6A6" w:sz="4"/>
+            </w:tcBorders>
+            <w:shd w:fill="E8F3EA" w:color="auto" w:val="clear"/>
+            <w:tcMar>
+              <w:top w:type="dxa" w:w="60"/>
+              <w:left w:type="dxa" w:w="100"/>
+              <w:bottom w:type="dxa" w:w="60"/>
+              <w:right w:type="dxa" w:w="100"/>
+            </w:tcMar>
+          </w:tcPr>
+          <w:p>
+            <w:pPr>
+              <w:jc w:val="left"/>
+            </w:pPr>
+            <w:r>
+              <w:rPr>
+                <w:rFonts w:ascii="Malgun Gothic" w:cs="Malgun Gothic" w:eastAsia="Malgun Gothic" w:hAnsi="Malgun Gothic"/>
+                <w:b w:val="false"/>
+                <w:bCs w:val="false"/>
+                <w:color w:val="000000"/>
+                <w:sz w:val="19"/>
+                <w:szCs w:val="19"/>
+              </w:rPr>
+              <w:t xml:space="preserve">Focus 선택</w:t>
+            </w:r>
+          </w:p>
+        </w:tc>
+        <w:tc>
+          <w:tcPr>
+            <w:tcW w:type="dxa" w:w="4200"/>
+            <w:tcBorders>
+              <w:top w:val="single" w:color="A6A6A6" w:sz="4"/>
+              <w:left w:val="single" w:color="A6A6A6" w:sz="4"/>
+              <w:bottom w:val="single" w:color="A6A6A6" w:sz="4"/>
+              <w:right w:val="single" w:color="A6A6A6" w:sz="4"/>
+            </w:tcBorders>
+            <w:shd w:fill="E8F3EA" w:color="auto" w:val="clear"/>
+            <w:tcMar>
+              <w:top w:type="dxa" w:w="60"/>
+              <w:left w:type="dxa" w:w="100"/>
+              <w:bottom w:type="dxa" w:w="60"/>
+              <w:right w:type="dxa" w:w="100"/>
+            </w:tcMar>
+          </w:tcPr>
+          <w:p>
+            <w:pPr>
+              <w:jc w:val="left"/>
+            </w:pPr>
+            <w:r>
+              <w:rPr>
+                <w:rFonts w:ascii="Malgun Gothic" w:cs="Malgun Gothic" w:eastAsia="Malgun Gothic" w:hAnsi="Malgun Gothic"/>
+                <w:b w:val="false"/>
+                <w:bCs w:val="false"/>
+                <w:color w:val="000000"/>
+                <w:sz w:val="19"/>
+                <w:szCs w:val="19"/>
+              </w:rPr>
+              <w:t xml:space="preserve">FIXED-FOCUS (OAK-1-PoE-FF)</w:t>
+            </w:r>
+          </w:p>
+        </w:tc>
+        <w:tc>
+          <w:tcPr>
+            <w:tcW w:type="dxa" w:w="1400"/>
+            <w:tcBorders>
+              <w:top w:val="single" w:color="A6A6A6" w:sz="4"/>
+              <w:left w:val="single" w:color="A6A6A6" w:sz="4"/>
+              <w:bottom w:val="single" w:color="A6A6A6" w:sz="4"/>
+              <w:right w:val="single" w:color="A6A6A6" w:sz="4"/>
+            </w:tcBorders>
+            <w:shd w:fill="E8F3EA" w:color="auto" w:val="clear"/>
+            <w:tcMar>
+              <w:top w:type="dxa" w:w="60"/>
+              <w:left w:type="dxa" w:w="100"/>
+              <w:bottom w:type="dxa" w:w="60"/>
+              <w:right w:type="dxa" w:w="100"/>
+            </w:tcMar>
+          </w:tcPr>
+          <w:p>
+            <w:pPr>
+              <w:jc w:val="center"/>
+            </w:pPr>
+            <w:r>
+              <w:rPr>
+                <w:rFonts w:ascii="Malgun Gothic" w:cs="Malgun Gothic" w:eastAsia="Malgun Gothic" w:hAnsi="Malgun Gothic"/>
+                <w:b/>
+                <w:bCs/>
+                <w:color w:val="1F7A3A"/>
+                <w:sz w:val="19"/>
+                <w:szCs w:val="19"/>
+              </w:rPr>
+              <w:t xml:space="preserve">✓ 고른다</w:t>
+            </w:r>
+          </w:p>
+        </w:tc>
+        <w:tc>
+          <w:tcPr>
+            <w:tcW w:type="dxa" w:w="6370"/>
+            <w:tcBorders>
+              <w:top w:val="single" w:color="A6A6A6" w:sz="4"/>
+              <w:left w:val="single" w:color="A6A6A6" w:sz="4"/>
+              <w:bottom w:val="single" w:color="A6A6A6" w:sz="4"/>
+              <w:right w:val="single" w:color="A6A6A6" w:sz="4"/>
+            </w:tcBorders>
+            <w:shd w:fill="E8F3EA" w:color="auto" w:val="clear"/>
+            <w:tcMar>
+              <w:top w:type="dxa" w:w="60"/>
+              <w:left w:type="dxa" w:w="100"/>
+              <w:bottom w:type="dxa" w:w="60"/>
+              <w:right w:type="dxa" w:w="100"/>
+            </w:tcMar>
+          </w:tcPr>
+          <w:p>
+            <w:pPr>
+              <w:jc w:val="left"/>
+            </w:pPr>
+            <w:r>
+              <w:rPr>
+                <w:rFonts w:ascii="Malgun Gothic" w:cs="Malgun Gothic" w:eastAsia="Malgun Gothic" w:hAnsi="Malgun Gothic"/>
+                <w:b w:val="false"/>
+                <w:bCs w:val="false"/>
+                <w:color w:val="000000"/>
+                <w:sz w:val="19"/>
+                <w:szCs w:val="19"/>
+              </w:rPr>
+              <w:t xml:space="preserve">HFOV 69°(AF 66° 보다 넓음), 50cm~∞ 고정. 부표는 전부 50cm 밖. 코드 hfov_deg 가 이 값 기준</w:t>
+            </w:r>
+          </w:p>
+        </w:tc>
+      </w:tr>
+      <w:tr>
+        <w:tc>
+          <w:tcPr>
+            <w:tcW w:type="dxa" w:w="2600"/>
+            <w:tcBorders>
+              <w:top w:val="single" w:color="A6A6A6" w:sz="4"/>
+              <w:left w:val="single" w:color="A6A6A6" w:sz="4"/>
+              <w:bottom w:val="single" w:color="A6A6A6" w:sz="4"/>
+              <w:right w:val="single" w:color="A6A6A6" w:sz="4"/>
+            </w:tcBorders>
+            <w:tcMar>
+              <w:top w:type="dxa" w:w="60"/>
+              <w:left w:type="dxa" w:w="100"/>
+              <w:bottom w:type="dxa" w:w="60"/>
+              <w:right w:type="dxa" w:w="100"/>
+            </w:tcMar>
+          </w:tcPr>
+          <w:p>
+            <w:pPr>
+              <w:jc w:val="left"/>
+            </w:pPr>
+            <w:r>
+              <w:rPr>
+                <w:rFonts w:ascii="Malgun Gothic" w:cs="Malgun Gothic" w:eastAsia="Malgun Gothic" w:hAnsi="Malgun Gothic"/>
+                <w:b w:val="false"/>
+                <w:bCs w:val="false"/>
+                <w:color w:val="000000"/>
+                <w:sz w:val="19"/>
+                <w:szCs w:val="19"/>
+              </w:rPr>
+              <w:t xml:space="preserve">Focus 선택</w:t>
+            </w:r>
+          </w:p>
+        </w:tc>
+        <w:tc>
+          <w:tcPr>
+            <w:tcW w:type="dxa" w:w="4200"/>
+            <w:tcBorders>
+              <w:top w:val="single" w:color="A6A6A6" w:sz="4"/>
+              <w:left w:val="single" w:color="A6A6A6" w:sz="4"/>
+              <w:bottom w:val="single" w:color="A6A6A6" w:sz="4"/>
+              <w:right w:val="single" w:color="A6A6A6" w:sz="4"/>
+            </w:tcBorders>
+            <w:tcMar>
+              <w:top w:type="dxa" w:w="60"/>
+              <w:left w:type="dxa" w:w="100"/>
+              <w:bottom w:type="dxa" w:w="60"/>
+              <w:right w:type="dxa" w:w="100"/>
+            </w:tcMar>
+          </w:tcPr>
+          <w:p>
+            <w:pPr>
+              <w:jc w:val="left"/>
+            </w:pPr>
+            <w:r>
+              <w:rPr>
+                <w:rFonts w:ascii="Malgun Gothic" w:cs="Malgun Gothic" w:eastAsia="Malgun Gothic" w:hAnsi="Malgun Gothic"/>
+                <w:b w:val="false"/>
+                <w:bCs w:val="false"/>
+                <w:color w:val="000000"/>
+                <w:sz w:val="19"/>
+                <w:szCs w:val="19"/>
+              </w:rPr>
+              <w:t xml:space="preserve">32MP (OAK-1-MAX-PoE) +87,000</w:t>
+            </w:r>
+          </w:p>
+        </w:tc>
+        <w:tc>
+          <w:tcPr>
+            <w:tcW w:type="dxa" w:w="1400"/>
+            <w:tcBorders>
+              <w:top w:val="single" w:color="A6A6A6" w:sz="4"/>
+              <w:left w:val="single" w:color="A6A6A6" w:sz="4"/>
+              <w:bottom w:val="single" w:color="A6A6A6" w:sz="4"/>
+              <w:right w:val="single" w:color="A6A6A6" w:sz="4"/>
+            </w:tcBorders>
+            <w:tcMar>
+              <w:top w:type="dxa" w:w="60"/>
+              <w:left w:type="dxa" w:w="100"/>
+              <w:bottom w:type="dxa" w:w="60"/>
+              <w:right w:type="dxa" w:w="100"/>
+            </w:tcMar>
+          </w:tcPr>
+          <w:p>
+            <w:pPr>
+              <w:jc w:val="center"/>
+            </w:pPr>
+            <w:r>
+              <w:rPr>
+                <w:rFonts w:ascii="Malgun Gothic" w:cs="Malgun Gothic" w:eastAsia="Malgun Gothic" w:hAnsi="Malgun Gothic"/>
+                <w:b/>
+                <w:bCs/>
+                <w:color w:val="C00000"/>
+                <w:sz w:val="19"/>
+                <w:szCs w:val="19"/>
+              </w:rPr>
+              <w:t xml:space="preserve">✗</w:t>
+            </w:r>
+          </w:p>
+        </w:tc>
+        <w:tc>
+          <w:tcPr>
+            <w:tcW w:type="dxa" w:w="6370"/>
+            <w:tcBorders>
+              <w:top w:val="single" w:color="A6A6A6" w:sz="4"/>
+              <w:left w:val="single" w:color="A6A6A6" w:sz="4"/>
+              <w:bottom w:val="single" w:color="A6A6A6" w:sz="4"/>
+              <w:right w:val="single" w:color="A6A6A6" w:sz="4"/>
+            </w:tcBorders>
+            <w:tcMar>
+              <w:top w:type="dxa" w:w="60"/>
+              <w:left w:type="dxa" w:w="100"/>
+              <w:bottom w:type="dxa" w:w="60"/>
+              <w:right w:type="dxa" w:w="100"/>
+            </w:tcMar>
+          </w:tcPr>
+          <w:p>
+            <w:pPr>
+              <w:jc w:val="left"/>
+            </w:pPr>
+            <w:r>
+              <w:rPr>
+                <w:rFonts w:ascii="Malgun Gothic" w:cs="Malgun Gothic" w:eastAsia="Malgun Gothic" w:hAnsi="Malgun Gothic"/>
+                <w:b w:val="false"/>
+                <w:bCs w:val="false"/>
+                <w:color w:val="000000"/>
+                <w:sz w:val="19"/>
+                <w:szCs w:val="19"/>
+              </w:rPr>
+              <w:t xml:space="preserve">HFOV 45° 로 좁아진다. 해상도는 남아돌고 시야만 손해. 2대면 174,000 추가</w:t>
+            </w:r>
+          </w:p>
+        </w:tc>
+      </w:tr>
+      <w:tr>
+        <w:tc>
+          <w:tcPr>
+            <w:tcW w:type="dxa" w:w="2600"/>
+            <w:tcBorders>
+              <w:top w:val="single" w:color="A6A6A6" w:sz="4"/>
+              <w:left w:val="single" w:color="A6A6A6" w:sz="4"/>
+              <w:bottom w:val="single" w:color="A6A6A6" w:sz="4"/>
+              <w:right w:val="single" w:color="A6A6A6" w:sz="4"/>
+            </w:tcBorders>
+            <w:tcMar>
+              <w:top w:type="dxa" w:w="60"/>
+              <w:left w:type="dxa" w:w="100"/>
+              <w:bottom w:type="dxa" w:w="60"/>
+              <w:right w:type="dxa" w:w="100"/>
+            </w:tcMar>
+          </w:tcPr>
+          <w:p>
+            <w:pPr>
+              <w:jc w:val="left"/>
+            </w:pPr>
+            <w:r>
+              <w:rPr>
+                <w:rFonts w:ascii="Malgun Gothic" w:cs="Malgun Gothic" w:eastAsia="Malgun Gothic" w:hAnsi="Malgun Gothic"/>
+                <w:b w:val="false"/>
+                <w:bCs w:val="false"/>
+                <w:color w:val="000000"/>
+                <w:sz w:val="19"/>
+                <w:szCs w:val="19"/>
+              </w:rPr>
+              <w:t xml:space="preserve">PoE Injector 선택</w:t>
+            </w:r>
+          </w:p>
+        </w:tc>
+        <w:tc>
+          <w:tcPr>
+            <w:tcW w:type="dxa" w:w="4200"/>
+            <w:tcBorders>
+              <w:top w:val="single" w:color="A6A6A6" w:sz="4"/>
+              <w:left w:val="single" w:color="A6A6A6" w:sz="4"/>
+              <w:bottom w:val="single" w:color="A6A6A6" w:sz="4"/>
+              <w:right w:val="single" w:color="A6A6A6" w:sz="4"/>
+            </w:tcBorders>
+            <w:tcMar>
+              <w:top w:type="dxa" w:w="60"/>
+              <w:left w:type="dxa" w:w="100"/>
+              <w:bottom w:type="dxa" w:w="60"/>
+              <w:right w:type="dxa" w:w="100"/>
+            </w:tcMar>
+          </w:tcPr>
+          <w:p>
+            <w:pPr>
+              <w:jc w:val="left"/>
+            </w:pPr>
+            <w:r>
+              <w:rPr>
+                <w:rFonts w:ascii="Malgun Gothic" w:cs="Malgun Gothic" w:eastAsia="Malgun Gothic" w:hAnsi="Malgun Gothic"/>
+                <w:b w:val="false"/>
+                <w:bCs w:val="false"/>
+                <w:color w:val="000000"/>
+                <w:sz w:val="19"/>
+                <w:szCs w:val="19"/>
+              </w:rPr>
+              <w:t xml:space="preserve">US Cord ; U-POE +42,000</w:t>
+            </w:r>
+          </w:p>
+        </w:tc>
+        <w:tc>
+          <w:tcPr>
+            <w:tcW w:type="dxa" w:w="1400"/>
+            <w:tcBorders>
+              <w:top w:val="single" w:color="A6A6A6" w:sz="4"/>
+              <w:left w:val="single" w:color="A6A6A6" w:sz="4"/>
+              <w:bottom w:val="single" w:color="A6A6A6" w:sz="4"/>
+              <w:right w:val="single" w:color="A6A6A6" w:sz="4"/>
+            </w:tcBorders>
+            <w:tcMar>
+              <w:top w:type="dxa" w:w="60"/>
+              <w:left w:type="dxa" w:w="100"/>
+              <w:bottom w:type="dxa" w:w="60"/>
+              <w:right w:type="dxa" w:w="100"/>
+            </w:tcMar>
+          </w:tcPr>
+          <w:p>
+            <w:pPr>
+              <w:jc w:val="center"/>
+            </w:pPr>
+            <w:r>
+              <w:rPr>
+                <w:rFonts w:ascii="Malgun Gothic" w:cs="Malgun Gothic" w:eastAsia="Malgun Gothic" w:hAnsi="Malgun Gothic"/>
+                <w:b/>
+                <w:bCs/>
+                <w:color w:val="C00000"/>
+                <w:sz w:val="19"/>
+                <w:szCs w:val="19"/>
+              </w:rPr>
+              <w:t xml:space="preserve">✗ 빈칸</w:t>
+            </w:r>
+          </w:p>
+        </w:tc>
+        <w:tc>
+          <w:tcPr>
+            <w:tcW w:type="dxa" w:w="6370"/>
+            <w:tcBorders>
+              <w:top w:val="single" w:color="A6A6A6" w:sz="4"/>
+              <w:left w:val="single" w:color="A6A6A6" w:sz="4"/>
+              <w:bottom w:val="single" w:color="A6A6A6" w:sz="4"/>
+              <w:right w:val="single" w:color="A6A6A6" w:sz="4"/>
+            </w:tcBorders>
+            <w:tcMar>
+              <w:top w:type="dxa" w:w="60"/>
+              <w:left w:type="dxa" w:w="100"/>
+              <w:bottom w:type="dxa" w:w="60"/>
+              <w:right w:type="dxa" w:w="100"/>
+            </w:tcMar>
+          </w:tcPr>
+          <w:p>
+            <w:pPr>
+              <w:jc w:val="left"/>
+            </w:pPr>
+            <w:r>
+              <w:rPr>
+                <w:rFonts w:ascii="Malgun Gothic" w:cs="Malgun Gothic" w:eastAsia="Malgun Gothic" w:hAnsi="Malgun Gothic"/>
+                <w:b w:val="false"/>
+                <w:bCs w:val="false"/>
+                <w:color w:val="000000"/>
+                <w:sz w:val="19"/>
+                <w:szCs w:val="19"/>
+              </w:rPr>
+              <w:t xml:space="preserve">110V 벽 콘센트용. 배엔 콘센트 없다. 4S 배터리용 REVOTECH 를 11번가에서 산다</w:t>
             </w:r>
           </w:p>
         </w:tc>
@@ -2691,7 +3394,7 @@
             </w:tcMar>
           </w:tcPr>
           <w:p>
-            <w:hyperlink w:history="1" r:id="rIdzfx7mdesbtzx4s8xtoy_o">
+            <w:hyperlink w:history="1" r:id="rIdpxg5nsrqouytw2gaq9dk0">
               <w:r>
                 <w:rPr>
                   <w:rStyle w:val="Hyperlink"/>
@@ -2712,7 +3415,7 @@
               </w:rPr>
               <w:t xml:space="preserve"> · </w:t>
             </w:r>
-            <w:hyperlink w:history="1" r:id="rId3wkyyrf1jladptoahg1vf">
+            <w:hyperlink w:history="1" r:id="rIddyhvozkbdflamv-czx91s">
               <w:r>
                 <w:rPr>
                   <w:rStyle w:val="Hyperlink"/>
@@ -3349,7 +4052,7 @@
             </w:tcMar>
           </w:tcPr>
           <w:p>
-            <w:hyperlink w:history="1" r:id="rIdhkl63xv0bgqhjbcayzi0f">
+            <w:hyperlink w:history="1" r:id="rIdmizjzu_nhqk1qh_dfaav1">
               <w:r>
                 <w:rPr>
                   <w:rStyle w:val="Hyperlink"/>
@@ -3532,7 +4235,7 @@
             </w:tcMar>
           </w:tcPr>
           <w:p>
-            <w:hyperlink w:history="1" r:id="rIdl4ixsdwzxaqejwfdsqpts">
+            <w:hyperlink w:history="1" r:id="rIdk94meg6wczbuu7vxoped5">
               <w:r>
                 <w:rPr>
                   <w:rStyle w:val="Hyperlink"/>
@@ -4144,7 +4847,7 @@
             </w:tcMar>
           </w:tcPr>
           <w:p>
-            <w:hyperlink w:history="1" r:id="rIdjwe9xupo7w8vpzff8x39i">
+            <w:hyperlink w:history="1" r:id="rIdlnbw7pyw1735cmrdtfgml">
               <w:r>
                 <w:rPr>
                   <w:rStyle w:val="Hyperlink"/>
@@ -4165,7 +4868,7 @@
               </w:rPr>
               <w:t xml:space="preserve"> · </w:t>
             </w:r>
-            <w:hyperlink w:history="1" r:id="rIdgzv0qltjfd57wej2vd_dw">
+            <w:hyperlink w:history="1" r:id="rIdr1nt5x8-lyui00fb1dba5">
               <w:r>
                 <w:rPr>
                   <w:rStyle w:val="Hyperlink"/>
@@ -4348,7 +5051,7 @@
             </w:tcMar>
           </w:tcPr>
           <w:p>
-            <w:hyperlink w:history="1" r:id="rIdztta3-ulc9z-rbt2q4mqx">
+            <w:hyperlink w:history="1" r:id="rId6kkxlr_90pibgsab5agto">
               <w:r>
                 <w:rPr>
                   <w:rStyle w:val="Hyperlink"/>
@@ -4531,7 +5234,7 @@
             </w:tcMar>
           </w:tcPr>
           <w:p>
-            <w:hyperlink w:history="1" r:id="rIdokjytihbfhkssjzewv53b">
+            <w:hyperlink w:history="1" r:id="rIdnacg1vpldkpaq3yxhqkq3">
               <w:r>
                 <w:rPr>
                   <w:rStyle w:val="Hyperlink"/>
@@ -4552,7 +5255,7 @@
               </w:rPr>
               <w:t xml:space="preserve"> · </w:t>
             </w:r>
-            <w:hyperlink w:history="1" r:id="rIdrsdevelalve4otdetscw2">
+            <w:hyperlink w:history="1" r:id="rIdg_4ydzselg_coc49p10ru">
               <w:r>
                 <w:rPr>
                   <w:rStyle w:val="Hyperlink"/>
@@ -5164,7 +5867,7 @@
             </w:tcMar>
           </w:tcPr>
           <w:p>
-            <w:hyperlink w:history="1" r:id="rIdbfdjwkkd2ba5fn8kcbhmj">
+            <w:hyperlink w:history="1" r:id="rIdojs7fdsvkliul-i7agh4r">
               <w:r>
                 <w:rPr>
                   <w:rStyle w:val="Hyperlink"/>
@@ -5398,7 +6101,7 @@
           <w:sz w:val="19"/>
           <w:szCs w:val="19"/>
         </w:rPr>
-        <w:t xml:space="preserve">리얼리스토어에 OAK 재고와 발송일을 문의한다. 132만원짜리의 납기를 아직 모른다.</w:t>
+        <w:t xml:space="preserve">리얼리스토어 031-8091-0707 (평일 09~18) 에 납기 문의. 페이지에 "해외에서 수입하여 판매" + 통관부호 수집 — 국내 재고가 아니라 주문 후 수입이다. 답이 2주 이상이어도 바로 발주한다.</w:t>
       </w:r>
     </w:p>
     <w:p>

</xml_diff>

<commit_message>
docs(구매): 인젝터 옥션 동급 ×2 확정(10-14) — 145,240→145,420, 합계 1,670,560~1,709,560, 발주서 정정, 워드 갱신
Co-Authored-By: Claude Fable 5.1 <noreply@anthropic.com>
</commit_message>
<xml_diff>
--- a/docs/전달용/SSF2026_구매목록_계통별.docx
+++ b/docs/전달용/SSF2026_구매목록_계통별.docx
@@ -282,7 +282,7 @@
                 <w:sz w:val="19"/>
                 <w:szCs w:val="19"/>
               </w:rPr>
-              <w:t xml:space="preserve">1,510,060 ~ 1,530,060</w:t>
+              <w:t xml:space="preserve">1,510,240 ~ 1,530,240</w:t>
             </w:r>
           </w:p>
         </w:tc>
@@ -1065,7 +1065,7 @@
                 <w:sz w:val="19"/>
                 <w:szCs w:val="19"/>
               </w:rPr>
-              <w:t xml:space="preserve">1,670,380 ~ 1,709,380</w:t>
+              <w:t xml:space="preserve">1,670,560 ~ 1,709,560</w:t>
             </w:r>
           </w:p>
         </w:tc>
@@ -1509,7 +1509,7 @@
             </w:tcMar>
           </w:tcPr>
           <w:p>
-            <w:hyperlink w:history="1" r:id="rIdhqnbomkrvmd_1i1sx9mxb">
+            <w:hyperlink w:history="1" r:id="rIdowo25n1f0rjkgqoy_wqmf">
               <w:r>
                 <w:rPr>
                   <w:rStyle w:val="Hyperlink"/>
@@ -1551,7 +1551,7 @@
                 <w:sz w:val="19"/>
                 <w:szCs w:val="19"/>
               </w:rPr>
-              <w:t xml:space="preserve">PoE 인젝터 REVOTECH PSE5502G</w:t>
+              <w:t xml:space="preserve">PoE 인젝터 30W DC 12-48V→48V DIN (옥션, PSE5502G 동급)</w:t>
             </w:r>
           </w:p>
         </w:tc>
@@ -1578,7 +1578,7 @@
                 <w:sz w:val="19"/>
                 <w:szCs w:val="19"/>
               </w:rPr>
-              <w:t xml:space="preserve">4S 배터리를 48V PoE 로 변환. 랜선 한 가닥으로 카메라 전원+데이터</w:t>
+              <w:t xml:space="preserve">4S 배터리를 48V PoE 로 변환. 랜선 한 가닥으로 카메라 전원+데이터. 11번가 PSE5502G 판매중지 → 10-14 옥션으로 확정. 발주 후 3~4일 내 발송 안 되면 하이링크 DIVA-IPoEI(190,000)로 전환</w:t>
             </w:r>
           </w:p>
         </w:tc>
@@ -1638,7 +1638,7 @@
                 <w:sz w:val="19"/>
                 <w:szCs w:val="19"/>
               </w:rPr>
-              <w:t xml:space="preserve">145,240</w:t>
+              <w:t xml:space="preserve">145,420</w:t>
             </w:r>
           </w:p>
         </w:tc>
@@ -1692,7 +1692,7 @@
             </w:tcMar>
           </w:tcPr>
           <w:p>
-            <w:hyperlink w:history="1" r:id="rIdwhkhklzmowj_dhvaxq48c">
+            <w:hyperlink w:history="1" r:id="rIdp4ucqprdd8m0t1rc-4dcp">
               <w:r>
                 <w:rPr>
                   <w:rStyle w:val="Hyperlink"/>
@@ -1702,9 +1702,30 @@
                   <w:szCs w:val="19"/>
                   <w:u w:val="single"/>
                 </w:rPr>
-                <w:t xml:space="preserve">11번가</w:t>
+                <w:t xml:space="preserve">옥션 F640411167</w:t>
               </w:r>
             </w:hyperlink>
+            <w:r>
+              <w:rPr>
+                <w:rFonts w:ascii="Malgun Gothic" w:cs="Malgun Gothic" w:eastAsia="Malgun Gothic" w:hAnsi="Malgun Gothic"/>
+                <w:sz w:val="19"/>
+                <w:szCs w:val="19"/>
+              </w:rPr>
+              <w:t xml:space="preserve"> · </w:t>
+            </w:r>
+            <w:hyperlink w:history="1" r:id="rIdi2djutmkvl0q6anxtnek3">
+              <w:r>
+                <w:rPr>
+                  <w:rStyle w:val="Hyperlink"/>
+                  <w:rFonts w:ascii="Malgun Gothic" w:cs="Malgun Gothic" w:eastAsia="Malgun Gothic" w:hAnsi="Malgun Gothic"/>
+                  <w:color w:val="0563C1"/>
+                  <w:sz w:val="19"/>
+                  <w:szCs w:val="19"/>
+                  <w:u w:val="single"/>
+                </w:rPr>
+                <w:t xml:space="preserve">대안 하이링크</w:t>
+              </w:r>
+            </w:hyperlink>
           </w:p>
         </w:tc>
       </w:tr>
@@ -1875,7 +1896,7 @@
             </w:tcMar>
           </w:tcPr>
           <w:p>
-            <w:hyperlink w:history="1" r:id="rIdzipp5tpefqooh8n2zbcre">
+            <w:hyperlink w:history="1" r:id="rIdtkkenrfikasdakui8msdo">
               <w:r>
                 <w:rPr>
                   <w:rStyle w:val="Hyperlink"/>
@@ -2058,7 +2079,7 @@
             </w:tcMar>
           </w:tcPr>
           <w:p>
-            <w:hyperlink w:history="1" r:id="rIdrwgvd6_orl_oj0pqmckvs">
+            <w:hyperlink w:history="1" r:id="rIdajcp6ebpesaweiahfcpns">
               <w:r>
                 <w:rPr>
                   <w:rStyle w:val="Hyperlink"/>
@@ -2079,7 +2100,7 @@
               </w:rPr>
               <w:t xml:space="preserve"> · </w:t>
             </w:r>
-            <w:hyperlink w:history="1" r:id="rId5s_nb1wrhygfhz8bilqtk">
+            <w:hyperlink w:history="1" r:id="rIddpkezxijkyt52vatswfhi">
               <w:r>
                 <w:rPr>
                   <w:rStyle w:val="Hyperlink"/>
@@ -2211,7 +2232,7 @@
                 <w:sz w:val="19"/>
                 <w:szCs w:val="19"/>
               </w:rPr>
-              <w:t xml:space="preserve">1,510,060 ~ 1,530,060</w:t>
+              <w:t xml:space="preserve">1,510,240 ~ 1,530,240</w:t>
             </w:r>
           </w:p>
         </w:tc>
@@ -3394,7 +3415,7 @@
             </w:tcMar>
           </w:tcPr>
           <w:p>
-            <w:hyperlink w:history="1" r:id="rIdpxg5nsrqouytw2gaq9dk0">
+            <w:hyperlink w:history="1" r:id="rIdaxjony3hh5vjve4isfww3">
               <w:r>
                 <w:rPr>
                   <w:rStyle w:val="Hyperlink"/>
@@ -3415,7 +3436,7 @@
               </w:rPr>
               <w:t xml:space="preserve"> · </w:t>
             </w:r>
-            <w:hyperlink w:history="1" r:id="rIddyhvozkbdflamv-czx91s">
+            <w:hyperlink w:history="1" r:id="rId5c8omvkzjv0cv6ebut5iw">
               <w:r>
                 <w:rPr>
                   <w:rStyle w:val="Hyperlink"/>
@@ -4052,7 +4073,7 @@
             </w:tcMar>
           </w:tcPr>
           <w:p>
-            <w:hyperlink w:history="1" r:id="rIdmizjzu_nhqk1qh_dfaav1">
+            <w:hyperlink w:history="1" r:id="rIdtcreeor2kiogmmbmhon0j">
               <w:r>
                 <w:rPr>
                   <w:rStyle w:val="Hyperlink"/>
@@ -4235,7 +4256,7 @@
             </w:tcMar>
           </w:tcPr>
           <w:p>
-            <w:hyperlink w:history="1" r:id="rIdk94meg6wczbuu7vxoped5">
+            <w:hyperlink w:history="1" r:id="rIdh4od2opw1odjrk80jzypr">
               <w:r>
                 <w:rPr>
                   <w:rStyle w:val="Hyperlink"/>
@@ -4847,7 +4868,7 @@
             </w:tcMar>
           </w:tcPr>
           <w:p>
-            <w:hyperlink w:history="1" r:id="rIdlnbw7pyw1735cmrdtfgml">
+            <w:hyperlink w:history="1" r:id="rIdpl3ytczri4o33qbfv5zf2">
               <w:r>
                 <w:rPr>
                   <w:rStyle w:val="Hyperlink"/>
@@ -4868,7 +4889,7 @@
               </w:rPr>
               <w:t xml:space="preserve"> · </w:t>
             </w:r>
-            <w:hyperlink w:history="1" r:id="rIdr1nt5x8-lyui00fb1dba5">
+            <w:hyperlink w:history="1" r:id="rIdnvfsdkg1ofxdfa5wah5ae">
               <w:r>
                 <w:rPr>
                   <w:rStyle w:val="Hyperlink"/>
@@ -5051,7 +5072,7 @@
             </w:tcMar>
           </w:tcPr>
           <w:p>
-            <w:hyperlink w:history="1" r:id="rId6kkxlr_90pibgsab5agto">
+            <w:hyperlink w:history="1" r:id="rId5qfm6jrpb4wkbaacv9-rk">
               <w:r>
                 <w:rPr>
                   <w:rStyle w:val="Hyperlink"/>
@@ -5234,7 +5255,7 @@
             </w:tcMar>
           </w:tcPr>
           <w:p>
-            <w:hyperlink w:history="1" r:id="rIdnacg1vpldkpaq3yxhqkq3">
+            <w:hyperlink w:history="1" r:id="rId_v9ftl9q7e2odswjh99u2">
               <w:r>
                 <w:rPr>
                   <w:rStyle w:val="Hyperlink"/>
@@ -5255,7 +5276,7 @@
               </w:rPr>
               <w:t xml:space="preserve"> · </w:t>
             </w:r>
-            <w:hyperlink w:history="1" r:id="rIdg_4ydzselg_coc49p10ru">
+            <w:hyperlink w:history="1" r:id="rIdfcg3j_wctai_hwgigaqtz">
               <w:r>
                 <w:rPr>
                   <w:rStyle w:val="Hyperlink"/>
@@ -5867,7 +5888,7 @@
             </w:tcMar>
           </w:tcPr>
           <w:p>
-            <w:hyperlink w:history="1" r:id="rIdojs7fdsvkliul-i7agh4r">
+            <w:hyperlink w:history="1" r:id="rIdi5d2jzlna4yz59vakoung">
               <w:r>
                 <w:rPr>
                   <w:rStyle w:val="Hyperlink"/>
@@ -7038,7 +7059,7 @@
                 <w:sz w:val="24"/>
                 <w:szCs w:val="24"/>
               </w:rPr>
-              <w:t xml:space="preserve">1,670,380 ~ 1,709,380</w:t>
+              <w:t xml:space="preserve">1,670,560 ~ 1,709,560</w:t>
             </w:r>
           </w:p>
         </w:tc>
@@ -7220,7 +7241,7 @@
                 <w:sz w:val="24"/>
                 <w:szCs w:val="24"/>
               </w:rPr>
-              <w:t xml:space="preserve">263,180 ~ 302,180</w:t>
+              <w:t xml:space="preserve">263,360 ~ 302,360</w:t>
             </w:r>
           </w:p>
         </w:tc>
@@ -7938,7 +7959,7 @@
                 <w:sz w:val="19"/>
                 <w:szCs w:val="19"/>
               </w:rPr>
-              <w:t xml:space="preserve">PoE 인젝터 REVOTECH ×2</w:t>
+              <w:t xml:space="preserve">PoE 인젝터 30W 12-48V (옥션) ×2</w:t>
             </w:r>
           </w:p>
         </w:tc>
@@ -7970,7 +7991,7 @@
                 <w:sz w:val="19"/>
                 <w:szCs w:val="19"/>
               </w:rPr>
-              <w:t xml:space="preserve">145,240</w:t>
+              <w:t xml:space="preserve">145,420</w:t>
             </w:r>
           </w:p>
         </w:tc>
@@ -8658,7 +8679,7 @@
                 <w:sz w:val="19"/>
                 <w:szCs w:val="19"/>
               </w:rPr>
-              <w:t xml:space="preserve">263,180 ~ 302,180</w:t>
+              <w:t xml:space="preserve">263,360 ~ 302,360</w:t>
             </w:r>
           </w:p>
         </w:tc>

</xml_diff>

<commit_message>
docs(구매): USB-C 어댑터 NETmate NM-UCL02 선정(AX88179, 18,490×2) — 합계 1,667,540~1,686,540
Co-Authored-By: Claude Fable 5.1 <noreply@anthropic.com>
</commit_message>
<xml_diff>
--- a/docs/전달용/SSF2026_구매목록_계통별.docx
+++ b/docs/전달용/SSF2026_구매목록_계통별.docx
@@ -39,7 +39,7 @@
           <w:sz w:val="19"/>
           <w:szCs w:val="19"/>
         </w:rPr>
-        <w:t xml:space="preserve">사야 할 것은 10항목, 합계 약 167~171만원이다. 아직 하나도 주문하지 않았다. 같은 계통 안에서 하나만 빠져도 그 계통은 안 돈다.</w:t>
+        <w:t xml:space="preserve">사야 할 것은 10항목, 합계 약 167~169만원이다. 아직 하나도 주문하지 않았다. 같은 계통 안에서 하나만 빠져도 그 계통은 안 돈다.</w:t>
       </w:r>
     </w:p>
     <w:tbl>
@@ -282,7 +282,7 @@
                 <w:sz w:val="19"/>
                 <w:szCs w:val="19"/>
               </w:rPr>
-              <w:t xml:space="preserve">1,510,240 ~ 1,530,240</w:t>
+              <w:t xml:space="preserve">1,507,220</w:t>
             </w:r>
           </w:p>
         </w:tc>
@@ -1065,7 +1065,7 @@
                 <w:sz w:val="19"/>
                 <w:szCs w:val="19"/>
               </w:rPr>
-              <w:t xml:space="preserve">1,670,560 ~ 1,709,560</w:t>
+              <w:t xml:space="preserve">1,667,540 ~ 1,686,540</w:t>
             </w:r>
           </w:p>
         </w:tc>
@@ -1098,7 +1098,7 @@
                 <w:sz w:val="19"/>
                 <w:szCs w:val="19"/>
               </w:rPr>
-              <w:t xml:space="preserve">OAK 2대가 77~79%</w:t>
+              <w:t xml:space="preserve">OAK 2대가 78~79%</w:t>
             </w:r>
           </w:p>
         </w:tc>
@@ -1509,7 +1509,7 @@
             </w:tcMar>
           </w:tcPr>
           <w:p>
-            <w:hyperlink w:history="1" r:id="rIdowo25n1f0rjkgqoy_wqmf">
+            <w:hyperlink w:history="1" r:id="rId4wcjqiholuyjitxdqewy3">
               <w:r>
                 <w:rPr>
                   <w:rStyle w:val="Hyperlink"/>
@@ -1692,7 +1692,7 @@
             </w:tcMar>
           </w:tcPr>
           <w:p>
-            <w:hyperlink w:history="1" r:id="rIdp4ucqprdd8m0t1rc-4dcp">
+            <w:hyperlink w:history="1" r:id="rIds2oerzbuxojcdbubvowgq">
               <w:r>
                 <w:rPr>
                   <w:rStyle w:val="Hyperlink"/>
@@ -1713,7 +1713,7 @@
               </w:rPr>
               <w:t xml:space="preserve"> · </w:t>
             </w:r>
-            <w:hyperlink w:history="1" r:id="rIdi2djutmkvl0q6anxtnek3">
+            <w:hyperlink w:history="1" r:id="rIdzkorzzu1pnvt046uk-dhl">
               <w:r>
                 <w:rPr>
                   <w:rStyle w:val="Hyperlink"/>
@@ -1755,7 +1755,7 @@
                 <w:sz w:val="19"/>
                 <w:szCs w:val="19"/>
               </w:rPr>
-              <w:t xml:space="preserve">USB-C 기가비트 어댑터 (AX88179 칩셋)</w:t>
+              <w:t xml:space="preserve">USB-C 기가비트 어댑터 강원전자 NETmate NM-UCL02</w:t>
             </w:r>
           </w:p>
         </w:tc>
@@ -1782,7 +1782,7 @@
                 <w:sz w:val="19"/>
                 <w:szCs w:val="19"/>
               </w:rPr>
-              <w:t xml:space="preserve">인젝터 LAN 과 노트북 연결. 노트북에 랜 포트가 없다. 1000Mbps 필수</w:t>
+              <w:t xml:space="preserve">인젝터 LAN 과 노트북 연결. 노트북에 랜 포트가 없다. 칩셋 ASIX AX88179 정확히 일치 — 우분투 기본 드라이버, 설치 0. 10-14 선정</w:t>
             </w:r>
           </w:p>
         </w:tc>
@@ -1842,7 +1842,7 @@
                 <w:sz w:val="19"/>
                 <w:szCs w:val="19"/>
               </w:rPr>
-              <w:t xml:space="preserve">40,000~60,000 (개당 2~3만)</w:t>
+              <w:t xml:space="preserve">36,980 (개당 18,490, 배송 3,000 별도)</w:t>
             </w:r>
           </w:p>
         </w:tc>
@@ -1896,7 +1896,7 @@
             </w:tcMar>
           </w:tcPr>
           <w:p>
-            <w:hyperlink w:history="1" r:id="rIdtkkenrfikasdakui8msdo">
+            <w:hyperlink w:history="1" r:id="rIdm-ikeetuso-bddqjzwnhg">
               <w:r>
                 <w:rPr>
                   <w:rStyle w:val="Hyperlink"/>
@@ -1906,7 +1906,7 @@
                   <w:szCs w:val="19"/>
                   <w:u w:val="single"/>
                 </w:rPr>
-                <w:t xml:space="preserve">다나와 검색</w:t>
+                <w:t xml:space="preserve">다나와 NM-UCL02</w:t>
               </w:r>
             </w:hyperlink>
           </w:p>
@@ -2079,7 +2079,7 @@
             </w:tcMar>
           </w:tcPr>
           <w:p>
-            <w:hyperlink w:history="1" r:id="rIdajcp6ebpesaweiahfcpns">
+            <w:hyperlink w:history="1" r:id="rIdujk80qch0se13k-xcbphz">
               <w:r>
                 <w:rPr>
                   <w:rStyle w:val="Hyperlink"/>
@@ -2100,7 +2100,7 @@
               </w:rPr>
               <w:t xml:space="preserve"> · </w:t>
             </w:r>
-            <w:hyperlink w:history="1" r:id="rIddpkezxijkyt52vatswfhi">
+            <w:hyperlink w:history="1" r:id="rId0kn8eh3g2se0y1qce2uxd">
               <w:r>
                 <w:rPr>
                   <w:rStyle w:val="Hyperlink"/>
@@ -2232,7 +2232,7 @@
                 <w:sz w:val="19"/>
                 <w:szCs w:val="19"/>
               </w:rPr>
-              <w:t xml:space="preserve">1,510,240 ~ 1,530,240</w:t>
+              <w:t xml:space="preserve">1,507,220</w:t>
             </w:r>
           </w:p>
         </w:tc>
@@ -3415,7 +3415,7 @@
             </w:tcMar>
           </w:tcPr>
           <w:p>
-            <w:hyperlink w:history="1" r:id="rIdaxjony3hh5vjve4isfww3">
+            <w:hyperlink w:history="1" r:id="rIdugnb_bhiyziwp-c6hkcsz">
               <w:r>
                 <w:rPr>
                   <w:rStyle w:val="Hyperlink"/>
@@ -3436,7 +3436,7 @@
               </w:rPr>
               <w:t xml:space="preserve"> · </w:t>
             </w:r>
-            <w:hyperlink w:history="1" r:id="rId5c8omvkzjv0cv6ebut5iw">
+            <w:hyperlink w:history="1" r:id="rIdaubmwuhsba0qtou9de-4r">
               <w:r>
                 <w:rPr>
                   <w:rStyle w:val="Hyperlink"/>
@@ -4073,7 +4073,7 @@
             </w:tcMar>
           </w:tcPr>
           <w:p>
-            <w:hyperlink w:history="1" r:id="rIdtcreeor2kiogmmbmhon0j">
+            <w:hyperlink w:history="1" r:id="rIdqgm9zc99iec0d4nskny8s">
               <w:r>
                 <w:rPr>
                   <w:rStyle w:val="Hyperlink"/>
@@ -4256,7 +4256,7 @@
             </w:tcMar>
           </w:tcPr>
           <w:p>
-            <w:hyperlink w:history="1" r:id="rIdh4od2opw1odjrk80jzypr">
+            <w:hyperlink w:history="1" r:id="rIdxtp2-ywt_iyxx9gymq2l2">
               <w:r>
                 <w:rPr>
                   <w:rStyle w:val="Hyperlink"/>
@@ -4868,7 +4868,7 @@
             </w:tcMar>
           </w:tcPr>
           <w:p>
-            <w:hyperlink w:history="1" r:id="rIdpl3ytczri4o33qbfv5zf2">
+            <w:hyperlink w:history="1" r:id="rIdlbuqai4s84stmvrj2dyuj">
               <w:r>
                 <w:rPr>
                   <w:rStyle w:val="Hyperlink"/>
@@ -4889,7 +4889,7 @@
               </w:rPr>
               <w:t xml:space="preserve"> · </w:t>
             </w:r>
-            <w:hyperlink w:history="1" r:id="rIdnvfsdkg1ofxdfa5wah5ae">
+            <w:hyperlink w:history="1" r:id="rIdpwnleb5cws13rerhzetsi">
               <w:r>
                 <w:rPr>
                   <w:rStyle w:val="Hyperlink"/>
@@ -5072,7 +5072,7 @@
             </w:tcMar>
           </w:tcPr>
           <w:p>
-            <w:hyperlink w:history="1" r:id="rId5qfm6jrpb4wkbaacv9-rk">
+            <w:hyperlink w:history="1" r:id="rIdq6lfhp8wlbmdvzdmyt9bq">
               <w:r>
                 <w:rPr>
                   <w:rStyle w:val="Hyperlink"/>
@@ -5255,7 +5255,7 @@
             </w:tcMar>
           </w:tcPr>
           <w:p>
-            <w:hyperlink w:history="1" r:id="rId_v9ftl9q7e2odswjh99u2">
+            <w:hyperlink w:history="1" r:id="rIdv6fd--0j84lqv_htmfptr">
               <w:r>
                 <w:rPr>
                   <w:rStyle w:val="Hyperlink"/>
@@ -5276,7 +5276,7 @@
               </w:rPr>
               <w:t xml:space="preserve"> · </w:t>
             </w:r>
-            <w:hyperlink w:history="1" r:id="rIdfcg3j_wctai_hwgigaqtz">
+            <w:hyperlink w:history="1" r:id="rIdtsz7biygbb3ah-2yomiup">
               <w:r>
                 <w:rPr>
                   <w:rStyle w:val="Hyperlink"/>
@@ -5888,7 +5888,7 @@
             </w:tcMar>
           </w:tcPr>
           <w:p>
-            <w:hyperlink w:history="1" r:id="rIdi5d2jzlna4yz59vakoung">
+            <w:hyperlink w:history="1" r:id="rId85-x5nz5-62dfyq9qtcr3">
               <w:r>
                 <w:rPr>
                   <w:rStyle w:val="Hyperlink"/>
@@ -6140,7 +6140,7 @@
           <w:sz w:val="19"/>
           <w:szCs w:val="19"/>
         </w:rPr>
-        <w:t xml:space="preserve">어댑터는 상세 페이지에서 칩셋이 AX88179 인지 직접 확인한다. 이름이 비슷한 TP-Link UE300C 는 RTL8153 이라 다르다.</w:t>
+        <w:t xml:space="preserve">어댑터는 NM-UCL02 로 확정(칩셋 AX88179). 다른 걸 살 땐 상세 페이지 칩셋을 직접 확인 — UE300C 는 RTL8153, NM-UCL01 은 AX88179A.</w:t>
       </w:r>
     </w:p>
     <w:p>
@@ -7059,7 +7059,7 @@
                 <w:sz w:val="24"/>
                 <w:szCs w:val="24"/>
               </w:rPr>
-              <w:t xml:space="preserve">1,670,560 ~ 1,709,560</w:t>
+              <w:t xml:space="preserve">1,667,540 ~ 1,686,540</w:t>
             </w:r>
           </w:p>
         </w:tc>
@@ -7241,7 +7241,7 @@
                 <w:sz w:val="24"/>
                 <w:szCs w:val="24"/>
               </w:rPr>
-              <w:t xml:space="preserve">263,360 ~ 302,360</w:t>
+              <w:t xml:space="preserve">260,340 ~ 279,340</w:t>
             </w:r>
           </w:p>
         </w:tc>
@@ -8057,7 +8057,7 @@
                 <w:sz w:val="19"/>
                 <w:szCs w:val="19"/>
               </w:rPr>
-              <w:t xml:space="preserve">USB-C 기가비트 어댑터 ×2</w:t>
+              <w:t xml:space="preserve">USB-C 어댑터 NM-UCL02 ×2</w:t>
             </w:r>
           </w:p>
         </w:tc>
@@ -8089,7 +8089,7 @@
                 <w:sz w:val="19"/>
                 <w:szCs w:val="19"/>
               </w:rPr>
-              <w:t xml:space="preserve">40,000 ~ 60,000</w:t>
+              <w:t xml:space="preserve">36,980</w:t>
             </w:r>
           </w:p>
         </w:tc>
@@ -8679,7 +8679,7 @@
                 <w:sz w:val="19"/>
                 <w:szCs w:val="19"/>
               </w:rPr>
-              <w:t xml:space="preserve">263,360 ~ 302,360</w:t>
+              <w:t xml:space="preserve">260,340 ~ 279,340</w:t>
             </w:r>
           </w:p>
         </w:tc>

</xml_diff>

<commit_message>
docs(구매): EC5 피그테일 암잭 ×3 추가(쿠팡 3,000×3, 10-14 팀) — 접촉기 앞 분기용, 합계 1,676,540~1,695,540
Co-Authored-By: Claude Fable 5.1 <noreply@anthropic.com>
</commit_message>
<xml_diff>
--- a/docs/전달용/SSF2026_구매목록_계통별.docx
+++ b/docs/전달용/SSF2026_구매목록_계통별.docx
@@ -39,7 +39,7 @@
           <w:sz w:val="19"/>
           <w:szCs w:val="19"/>
         </w:rPr>
-        <w:t xml:space="preserve">사야 할 것은 10항목, 합계 약 167~169만원이다. 아직 하나도 주문하지 않았다. 같은 계통 안에서 하나만 빠져도 그 계통은 안 돈다.</w:t>
+        <w:t xml:space="preserve">사야 할 것은 11항목, 합계 약 168~170만원이다. 아직 하나도 주문하지 않았다. 같은 계통 안에서 하나만 빠져도 그 계통은 안 돈다.</w:t>
       </w:r>
     </w:p>
     <w:tbl>
@@ -868,7 +868,7 @@
                 <w:sz w:val="19"/>
                 <w:szCs w:val="19"/>
               </w:rPr>
-              <w:t xml:space="preserve">G. 제어 (Mega)</w:t>
+              <w:t xml:space="preserve">F. 주 전력 (EC5)</w:t>
             </w:r>
           </w:p>
         </w:tc>
@@ -932,7 +932,7 @@
                 <w:sz w:val="19"/>
                 <w:szCs w:val="19"/>
               </w:rPr>
-              <w:t xml:space="preserve">58,000</w:t>
+              <w:t xml:space="preserve">9,000</w:t>
             </w:r>
           </w:p>
         </w:tc>
@@ -964,7 +964,7 @@
                 <w:sz w:val="19"/>
                 <w:szCs w:val="19"/>
               </w:rPr>
-              <w:t xml:space="preserve">P0 — 2번배용. 지원금 들어옴</w:t>
+              <w:t xml:space="preserve">P0 — 분기용 피그테일 ×3</w:t>
             </w:r>
           </w:p>
         </w:tc>
@@ -979,6 +979,136 @@
               <w:bottom w:val="single" w:color="A6A6A6" w:sz="4"/>
               <w:right w:val="single" w:color="A6A6A6" w:sz="4"/>
             </w:tcBorders>
+            <w:tcMar>
+              <w:top w:type="dxa" w:w="60"/>
+              <w:left w:type="dxa" w:w="100"/>
+              <w:bottom w:type="dxa" w:w="60"/>
+              <w:right w:type="dxa" w:w="100"/>
+            </w:tcMar>
+          </w:tcPr>
+          <w:p>
+            <w:pPr>
+              <w:jc w:val="left"/>
+            </w:pPr>
+            <w:r>
+              <w:rPr>
+                <w:rFonts w:ascii="Malgun Gothic" w:cs="Malgun Gothic" w:eastAsia="Malgun Gothic" w:hAnsi="Malgun Gothic"/>
+                <w:b/>
+                <w:bCs/>
+                <w:sz w:val="19"/>
+                <w:szCs w:val="19"/>
+              </w:rPr>
+              <w:t xml:space="preserve">G. 제어 (Mega)</w:t>
+            </w:r>
+          </w:p>
+        </w:tc>
+        <w:tc>
+          <w:tcPr>
+            <w:tcW w:type="dxa" w:w="2000"/>
+            <w:tcBorders>
+              <w:top w:val="single" w:color="A6A6A6" w:sz="4"/>
+              <w:left w:val="single" w:color="A6A6A6" w:sz="4"/>
+              <w:bottom w:val="single" w:color="A6A6A6" w:sz="4"/>
+              <w:right w:val="single" w:color="A6A6A6" w:sz="4"/>
+            </w:tcBorders>
+            <w:tcMar>
+              <w:top w:type="dxa" w:w="60"/>
+              <w:left w:type="dxa" w:w="100"/>
+              <w:bottom w:type="dxa" w:w="60"/>
+              <w:right w:type="dxa" w:w="100"/>
+            </w:tcMar>
+          </w:tcPr>
+          <w:p>
+            <w:pPr>
+              <w:jc w:val="center"/>
+            </w:pPr>
+            <w:r>
+              <w:rPr>
+                <w:rFonts w:ascii="Malgun Gothic" w:cs="Malgun Gothic" w:eastAsia="Malgun Gothic" w:hAnsi="Malgun Gothic"/>
+                <w:b w:val="false"/>
+                <w:bCs w:val="false"/>
+                <w:sz w:val="19"/>
+                <w:szCs w:val="19"/>
+              </w:rPr>
+              <w:t xml:space="preserve">1</w:t>
+            </w:r>
+          </w:p>
+        </w:tc>
+        <w:tc>
+          <w:tcPr>
+            <w:tcW w:type="dxa" w:w="3500"/>
+            <w:tcBorders>
+              <w:top w:val="single" w:color="A6A6A6" w:sz="4"/>
+              <w:left w:val="single" w:color="A6A6A6" w:sz="4"/>
+              <w:bottom w:val="single" w:color="A6A6A6" w:sz="4"/>
+              <w:right w:val="single" w:color="A6A6A6" w:sz="4"/>
+            </w:tcBorders>
+            <w:tcMar>
+              <w:top w:type="dxa" w:w="60"/>
+              <w:left w:type="dxa" w:w="100"/>
+              <w:bottom w:type="dxa" w:w="60"/>
+              <w:right w:type="dxa" w:w="100"/>
+            </w:tcMar>
+          </w:tcPr>
+          <w:p>
+            <w:pPr>
+              <w:jc w:val="right"/>
+            </w:pPr>
+            <w:r>
+              <w:rPr>
+                <w:rFonts w:ascii="Malgun Gothic" w:cs="Malgun Gothic" w:eastAsia="Malgun Gothic" w:hAnsi="Malgun Gothic"/>
+                <w:b w:val="false"/>
+                <w:bCs w:val="false"/>
+                <w:sz w:val="19"/>
+                <w:szCs w:val="19"/>
+              </w:rPr>
+              <w:t xml:space="preserve">58,000</w:t>
+            </w:r>
+          </w:p>
+        </w:tc>
+        <w:tc>
+          <w:tcPr>
+            <w:tcW w:type="dxa" w:w="4070"/>
+            <w:tcBorders>
+              <w:top w:val="single" w:color="A6A6A6" w:sz="4"/>
+              <w:left w:val="single" w:color="A6A6A6" w:sz="4"/>
+              <w:bottom w:val="single" w:color="A6A6A6" w:sz="4"/>
+              <w:right w:val="single" w:color="A6A6A6" w:sz="4"/>
+            </w:tcBorders>
+            <w:tcMar>
+              <w:top w:type="dxa" w:w="60"/>
+              <w:left w:type="dxa" w:w="100"/>
+              <w:bottom w:type="dxa" w:w="60"/>
+              <w:right w:type="dxa" w:w="100"/>
+            </w:tcMar>
+          </w:tcPr>
+          <w:p>
+            <w:pPr>
+              <w:jc w:val="left"/>
+            </w:pPr>
+            <w:r>
+              <w:rPr>
+                <w:rFonts w:ascii="Malgun Gothic" w:cs="Malgun Gothic" w:eastAsia="Malgun Gothic" w:hAnsi="Malgun Gothic"/>
+                <w:b w:val="false"/>
+                <w:bCs w:val="false"/>
+                <w:sz w:val="19"/>
+                <w:szCs w:val="19"/>
+              </w:rPr>
+              <w:t xml:space="preserve">P0 — 2번배용. 지원금 들어옴</w:t>
+            </w:r>
+          </w:p>
+        </w:tc>
+      </w:tr>
+      <w:tr>
+        <w:tc>
+          <w:tcPr>
+            <w:tcW w:type="dxa" w:w="5000"/>
+            <w:tcBorders>
+              <w:top w:val="single" w:color="A6A6A6" w:sz="4"/>
+              <w:left w:val="single" w:color="A6A6A6" w:sz="4"/>
+              <w:bottom w:val="single" w:color="A6A6A6" w:sz="4"/>
+              <w:right w:val="single" w:color="A6A6A6" w:sz="4"/>
+            </w:tcBorders>
             <w:shd w:fill="F2F2F2" w:color="auto" w:val="clear"/>
             <w:tcMar>
               <w:top w:type="dxa" w:w="60"/>
@@ -1032,7 +1162,7 @@
                 <w:sz w:val="19"/>
                 <w:szCs w:val="19"/>
               </w:rPr>
-              <w:t xml:space="preserve">10</w:t>
+              <w:t xml:space="preserve">11</w:t>
             </w:r>
           </w:p>
         </w:tc>
@@ -1065,7 +1195,7 @@
                 <w:sz w:val="19"/>
                 <w:szCs w:val="19"/>
               </w:rPr>
-              <w:t xml:space="preserve">1,667,540 ~ 1,686,540</w:t>
+              <w:t xml:space="preserve">1,676,540 ~ 1,695,540</w:t>
             </w:r>
           </w:p>
         </w:tc>
@@ -1509,7 +1639,7 @@
             </w:tcMar>
           </w:tcPr>
           <w:p>
-            <w:hyperlink w:history="1" r:id="rIdantzpiizq9hbh8lnc8qyt">
+            <w:hyperlink w:history="1" r:id="rIdynnmhliyqgndgrqn1lxft">
               <w:r>
                 <w:rPr>
                   <w:rStyle w:val="Hyperlink"/>
@@ -1692,7 +1822,7 @@
             </w:tcMar>
           </w:tcPr>
           <w:p>
-            <w:hyperlink w:history="1" r:id="rIdme-gxdlv9hwtagtp8c6t8">
+            <w:hyperlink w:history="1" r:id="rIdcdzsaxbt4jwix_xz_7fdb">
               <w:r>
                 <w:rPr>
                   <w:rStyle w:val="Hyperlink"/>
@@ -1713,7 +1843,7 @@
               </w:rPr>
               <w:t xml:space="preserve"> · </w:t>
             </w:r>
-            <w:hyperlink w:history="1" r:id="rId2swiyqmwuftzpixo-b85z">
+            <w:hyperlink w:history="1" r:id="rIdvi3ssagv1oritp6xkjpjc">
               <w:r>
                 <w:rPr>
                   <w:rStyle w:val="Hyperlink"/>
@@ -1896,7 +2026,7 @@
             </w:tcMar>
           </w:tcPr>
           <w:p>
-            <w:hyperlink w:history="1" r:id="rIdego_f-wnxwkkmbwnfswdl">
+            <w:hyperlink w:history="1" r:id="rId5mv4prlzyc9bhekaxkuym">
               <w:r>
                 <w:rPr>
                   <w:rStyle w:val="Hyperlink"/>
@@ -2079,7 +2209,7 @@
             </w:tcMar>
           </w:tcPr>
           <w:p>
-            <w:hyperlink w:history="1" r:id="rIdqvc8ln5ctolvwtmp4mgte">
+            <w:hyperlink w:history="1" r:id="rIdlq1vejzkc-ikvsbn_tcvj">
               <w:r>
                 <w:rPr>
                   <w:rStyle w:val="Hyperlink"/>
@@ -2100,7 +2230,7 @@
               </w:rPr>
               <w:t xml:space="preserve"> · </w:t>
             </w:r>
-            <w:hyperlink w:history="1" r:id="rIdtzkjcdhs46xwz_mdanjk-">
+            <w:hyperlink w:history="1" r:id="rIdp2nsgnjplxxjsgmtjkpo3">
               <w:r>
                 <w:rPr>
                   <w:rStyle w:val="Hyperlink"/>
@@ -4386,7 +4516,7 @@
             </w:tcMar>
           </w:tcPr>
           <w:p>
-            <w:hyperlink w:history="1" r:id="rIdbtskd3eyjsfb4si9cofka">
+            <w:hyperlink w:history="1" r:id="rIdnzdezdjuwyfr-uf3_f6on">
               <w:r>
                 <w:rPr>
                   <w:rStyle w:val="Hyperlink"/>
@@ -4407,7 +4537,7 @@
               </w:rPr>
               <w:t xml:space="preserve"> · </w:t>
             </w:r>
-            <w:hyperlink w:history="1" r:id="rId3cx3eajvegkdk3t98uvdf">
+            <w:hyperlink w:history="1" r:id="rId088npgs21cpwux6rrxq_r">
               <w:r>
                 <w:rPr>
                   <w:rStyle w:val="Hyperlink"/>
@@ -5044,7 +5174,7 @@
             </w:tcMar>
           </w:tcPr>
           <w:p>
-            <w:hyperlink w:history="1" r:id="rIdcmqnkaqcrh7o7ukf0pwpt">
+            <w:hyperlink w:history="1" r:id="rIdt_39vicl2cghctokzhoyl">
               <w:r>
                 <w:rPr>
                   <w:rStyle w:val="Hyperlink"/>
@@ -5227,7 +5357,7 @@
             </w:tcMar>
           </w:tcPr>
           <w:p>
-            <w:hyperlink w:history="1" r:id="rId-kp-wadngr8eopgeman3y">
+            <w:hyperlink w:history="1" r:id="rIdfsjmlsraip7z76k3osqen">
               <w:r>
                 <w:rPr>
                   <w:rStyle w:val="Hyperlink"/>
@@ -5839,7 +5969,7 @@
             </w:tcMar>
           </w:tcPr>
           <w:p>
-            <w:hyperlink w:history="1" r:id="rIdn37xjlt632ze2lsrtsjhr">
+            <w:hyperlink w:history="1" r:id="rIdbjmpzxcadawhbro8gbilm">
               <w:r>
                 <w:rPr>
                   <w:rStyle w:val="Hyperlink"/>
@@ -5860,7 +5990,7 @@
               </w:rPr>
               <w:t xml:space="preserve"> · </w:t>
             </w:r>
-            <w:hyperlink w:history="1" r:id="rIdobxxx1i_y1ijzongm_lh_">
+            <w:hyperlink w:history="1" r:id="rIdh76x3soiectmgnn-nv1si">
               <w:r>
                 <w:rPr>
                   <w:rStyle w:val="Hyperlink"/>
@@ -6043,7 +6173,7 @@
             </w:tcMar>
           </w:tcPr>
           <w:p>
-            <w:hyperlink w:history="1" r:id="rIdt13fcamiot0kqms4kgnbs">
+            <w:hyperlink w:history="1" r:id="rIdxh58gvkdltbzwf3gmu4gb">
               <w:r>
                 <w:rPr>
                   <w:rStyle w:val="Hyperlink"/>
@@ -6226,7 +6356,7 @@
             </w:tcMar>
           </w:tcPr>
           <w:p>
-            <w:hyperlink w:history="1" r:id="rIdjghbdzalefodk0tz7dnoc">
+            <w:hyperlink w:history="1" r:id="rIdrppyai1yadjpuzqunyzhq">
               <w:r>
                 <w:rPr>
                   <w:rStyle w:val="Hyperlink"/>
@@ -6247,7 +6377,7 @@
               </w:rPr>
               <w:t xml:space="preserve"> · </w:t>
             </w:r>
-            <w:hyperlink w:history="1" r:id="rId1bxdeqfqpqfju5bqfy1i8">
+            <w:hyperlink w:history="1" r:id="rIddkmony9pukhghkxieomb-">
               <w:r>
                 <w:rPr>
                   <w:rStyle w:val="Hyperlink"/>
@@ -6452,6 +6582,618 @@
           <w:szCs w:val="18"/>
         </w:rPr>
         <w:t xml:space="preserve">아두이노는 허브에 꽂지 않는다. 허브를 거치면 수신기 전압이 4.09V 까지 떨어진다(최소 4.0V).</w:t>
+      </w:r>
+    </w:p>
+    <w:p>
+      <w:pPr>
+        <w:pStyle w:val="Heading2"/>
+        <w:spacing w:after="100" w:before="280"/>
+      </w:pPr>
+      <w:r>
+        <w:rPr>
+          <w:rFonts w:ascii="Malgun Gothic" w:cs="Malgun Gothic" w:eastAsia="Malgun Gothic" w:hAnsi="Malgun Gothic"/>
+        </w:rPr>
+        <w:t xml:space="preserve">F. 주 전력 계통 — EC5 분기 피그테일</w:t>
+      </w:r>
+    </w:p>
+    <w:p>
+      <w:pPr>
+        <w:shd w:fill="F2F2F2" w:color="auto" w:val="clear"/>
+        <w:spacing w:after="100"/>
+      </w:pPr>
+      <w:r>
+        <w:rPr>
+          <w:rFonts w:ascii="Consolas" w:cs="Consolas" w:eastAsia="Consolas" w:hAnsi="Consolas"/>
+          <w:color w:val="404040"/>
+          <w:sz w:val="17"/>
+          <w:szCs w:val="17"/>
+        </w:rPr>
+        <w:t xml:space="preserve">배터리A EC5 ─┬─▶ (기존) 접촉기 5번 ─▶ ESC        └─ EC5 암잭 피그테일 ─▶ 접촉기 앞 분기: 컨버터·인젝터·XL4015 IN+</w:t>
+      </w:r>
+    </w:p>
+    <w:tbl>
+      <w:tblPr>
+        <w:tblW w:type="dxa" w:w="14570"/>
+        <w:tblBorders>
+          <w:top w:val="single" w:color="auto" w:sz="4"/>
+          <w:left w:val="single" w:color="auto" w:sz="4"/>
+          <w:bottom w:val="single" w:color="auto" w:sz="4"/>
+          <w:right w:val="single" w:color="auto" w:sz="4"/>
+          <w:insideH w:val="single" w:color="auto" w:sz="4"/>
+          <w:insideV w:val="single" w:color="auto" w:sz="4"/>
+        </w:tblBorders>
+      </w:tblPr>
+      <w:tblGrid>
+        <w:gridCol w:w="3000"/>
+        <w:gridCol w:w="4000"/>
+        <w:gridCol w:w="1100"/>
+        <w:gridCol w:w="2300"/>
+        <w:gridCol w:w="700"/>
+        <w:gridCol w:w="3470"/>
+      </w:tblGrid>
+      <w:tr>
+        <w:trPr>
+          <w:tblHeader/>
+        </w:trPr>
+        <w:tc>
+          <w:tcPr>
+            <w:tcW w:type="dxa" w:w="3000"/>
+            <w:tcBorders>
+              <w:top w:val="single" w:color="A6A6A6" w:sz="4"/>
+              <w:left w:val="single" w:color="A6A6A6" w:sz="4"/>
+              <w:bottom w:val="single" w:color="A6A6A6" w:sz="4"/>
+              <w:right w:val="single" w:color="A6A6A6" w:sz="4"/>
+            </w:tcBorders>
+            <w:shd w:fill="1F3864" w:color="auto" w:val="clear"/>
+            <w:tcMar>
+              <w:top w:type="dxa" w:w="60"/>
+              <w:left w:type="dxa" w:w="100"/>
+              <w:bottom w:type="dxa" w:w="60"/>
+              <w:right w:type="dxa" w:w="100"/>
+            </w:tcMar>
+          </w:tcPr>
+          <w:p>
+            <w:r>
+              <w:rPr>
+                <w:rFonts w:ascii="Malgun Gothic" w:cs="Malgun Gothic" w:eastAsia="Malgun Gothic" w:hAnsi="Malgun Gothic"/>
+                <w:b/>
+                <w:bCs/>
+                <w:color w:val="FFFFFF"/>
+                <w:sz w:val="19"/>
+                <w:szCs w:val="19"/>
+              </w:rPr>
+              <w:t xml:space="preserve">품목</w:t>
+            </w:r>
+          </w:p>
+        </w:tc>
+        <w:tc>
+          <w:tcPr>
+            <w:tcW w:type="dxa" w:w="4000"/>
+            <w:tcBorders>
+              <w:top w:val="single" w:color="A6A6A6" w:sz="4"/>
+              <w:left w:val="single" w:color="A6A6A6" w:sz="4"/>
+              <w:bottom w:val="single" w:color="A6A6A6" w:sz="4"/>
+              <w:right w:val="single" w:color="A6A6A6" w:sz="4"/>
+            </w:tcBorders>
+            <w:shd w:fill="1F3864" w:color="auto" w:val="clear"/>
+            <w:tcMar>
+              <w:top w:type="dxa" w:w="60"/>
+              <w:left w:type="dxa" w:w="100"/>
+              <w:bottom w:type="dxa" w:w="60"/>
+              <w:right w:type="dxa" w:w="100"/>
+            </w:tcMar>
+          </w:tcPr>
+          <w:p>
+            <w:r>
+              <w:rPr>
+                <w:rFonts w:ascii="Malgun Gothic" w:cs="Malgun Gothic" w:eastAsia="Malgun Gothic" w:hAnsi="Malgun Gothic"/>
+                <w:b/>
+                <w:bCs/>
+                <w:color w:val="FFFFFF"/>
+                <w:sz w:val="19"/>
+                <w:szCs w:val="19"/>
+              </w:rPr>
+              <w:t xml:space="preserve">용도 — 어디에 쓰나</w:t>
+            </w:r>
+          </w:p>
+        </w:tc>
+        <w:tc>
+          <w:tcPr>
+            <w:tcW w:type="dxa" w:w="1100"/>
+            <w:tcBorders>
+              <w:top w:val="single" w:color="A6A6A6" w:sz="4"/>
+              <w:left w:val="single" w:color="A6A6A6" w:sz="4"/>
+              <w:bottom w:val="single" w:color="A6A6A6" w:sz="4"/>
+              <w:right w:val="single" w:color="A6A6A6" w:sz="4"/>
+            </w:tcBorders>
+            <w:shd w:fill="1F3864" w:color="auto" w:val="clear"/>
+            <w:tcMar>
+              <w:top w:type="dxa" w:w="60"/>
+              <w:left w:type="dxa" w:w="100"/>
+              <w:bottom w:type="dxa" w:w="60"/>
+              <w:right w:type="dxa" w:w="100"/>
+            </w:tcMar>
+          </w:tcPr>
+          <w:p>
+            <w:r>
+              <w:rPr>
+                <w:rFonts w:ascii="Malgun Gothic" w:cs="Malgun Gothic" w:eastAsia="Malgun Gothic" w:hAnsi="Malgun Gothic"/>
+                <w:b/>
+                <w:bCs/>
+                <w:color w:val="FFFFFF"/>
+                <w:sz w:val="19"/>
+                <w:szCs w:val="19"/>
+              </w:rPr>
+              <w:t xml:space="preserve">수량</w:t>
+            </w:r>
+          </w:p>
+        </w:tc>
+        <w:tc>
+          <w:tcPr>
+            <w:tcW w:type="dxa" w:w="2300"/>
+            <w:tcBorders>
+              <w:top w:val="single" w:color="A6A6A6" w:sz="4"/>
+              <w:left w:val="single" w:color="A6A6A6" w:sz="4"/>
+              <w:bottom w:val="single" w:color="A6A6A6" w:sz="4"/>
+              <w:right w:val="single" w:color="A6A6A6" w:sz="4"/>
+            </w:tcBorders>
+            <w:shd w:fill="1F3864" w:color="auto" w:val="clear"/>
+            <w:tcMar>
+              <w:top w:type="dxa" w:w="60"/>
+              <w:left w:type="dxa" w:w="100"/>
+              <w:bottom w:type="dxa" w:w="60"/>
+              <w:right w:type="dxa" w:w="100"/>
+            </w:tcMar>
+          </w:tcPr>
+          <w:p>
+            <w:r>
+              <w:rPr>
+                <w:rFonts w:ascii="Malgun Gothic" w:cs="Malgun Gothic" w:eastAsia="Malgun Gothic" w:hAnsi="Malgun Gothic"/>
+                <w:b/>
+                <w:bCs/>
+                <w:color w:val="FFFFFF"/>
+                <w:sz w:val="19"/>
+                <w:szCs w:val="19"/>
+              </w:rPr>
+              <w:t xml:space="preserve">금액(원)</w:t>
+            </w:r>
+          </w:p>
+        </w:tc>
+        <w:tc>
+          <w:tcPr>
+            <w:tcW w:type="dxa" w:w="700"/>
+            <w:tcBorders>
+              <w:top w:val="single" w:color="A6A6A6" w:sz="4"/>
+              <w:left w:val="single" w:color="A6A6A6" w:sz="4"/>
+              <w:bottom w:val="single" w:color="A6A6A6" w:sz="4"/>
+              <w:right w:val="single" w:color="A6A6A6" w:sz="4"/>
+            </w:tcBorders>
+            <w:shd w:fill="1F3864" w:color="auto" w:val="clear"/>
+            <w:tcMar>
+              <w:top w:type="dxa" w:w="60"/>
+              <w:left w:type="dxa" w:w="100"/>
+              <w:bottom w:type="dxa" w:w="60"/>
+              <w:right w:type="dxa" w:w="100"/>
+            </w:tcMar>
+          </w:tcPr>
+          <w:p>
+            <w:r>
+              <w:rPr>
+                <w:rFonts w:ascii="Malgun Gothic" w:cs="Malgun Gothic" w:eastAsia="Malgun Gothic" w:hAnsi="Malgun Gothic"/>
+                <w:b/>
+                <w:bCs/>
+                <w:color w:val="FFFFFF"/>
+                <w:sz w:val="19"/>
+                <w:szCs w:val="19"/>
+              </w:rPr>
+              <w:t xml:space="preserve">우선</w:t>
+            </w:r>
+          </w:p>
+        </w:tc>
+        <w:tc>
+          <w:tcPr>
+            <w:tcW w:type="dxa" w:w="3470"/>
+            <w:tcBorders>
+              <w:top w:val="single" w:color="A6A6A6" w:sz="4"/>
+              <w:left w:val="single" w:color="A6A6A6" w:sz="4"/>
+              <w:bottom w:val="single" w:color="A6A6A6" w:sz="4"/>
+              <w:right w:val="single" w:color="A6A6A6" w:sz="4"/>
+            </w:tcBorders>
+            <w:shd w:fill="1F3864" w:color="auto" w:val="clear"/>
+            <w:tcMar>
+              <w:top w:type="dxa" w:w="60"/>
+              <w:left w:type="dxa" w:w="100"/>
+              <w:bottom w:type="dxa" w:w="60"/>
+              <w:right w:type="dxa" w:w="100"/>
+            </w:tcMar>
+          </w:tcPr>
+          <w:p>
+            <w:r>
+              <w:rPr>
+                <w:rFonts w:ascii="Malgun Gothic" w:cs="Malgun Gothic" w:eastAsia="Malgun Gothic" w:hAnsi="Malgun Gothic"/>
+                <w:b/>
+                <w:bCs/>
+                <w:color w:val="FFFFFF"/>
+                <w:sz w:val="19"/>
+                <w:szCs w:val="19"/>
+              </w:rPr>
+              <w:t xml:space="preserve">구매 링크</w:t>
+            </w:r>
+          </w:p>
+        </w:tc>
+      </w:tr>
+      <w:tr>
+        <w:tc>
+          <w:tcPr>
+            <w:tcW w:type="dxa" w:w="3000"/>
+            <w:tcBorders>
+              <w:top w:val="single" w:color="A6A6A6" w:sz="4"/>
+              <w:left w:val="single" w:color="A6A6A6" w:sz="4"/>
+              <w:bottom w:val="single" w:color="A6A6A6" w:sz="4"/>
+              <w:right w:val="single" w:color="A6A6A6" w:sz="4"/>
+            </w:tcBorders>
+            <w:tcMar>
+              <w:top w:type="dxa" w:w="60"/>
+              <w:left w:type="dxa" w:w="100"/>
+              <w:bottom w:type="dxa" w:w="60"/>
+              <w:right w:type="dxa" w:w="100"/>
+            </w:tcMar>
+          </w:tcPr>
+          <w:p>
+            <w:r>
+              <w:rPr>
+                <w:rFonts w:ascii="Malgun Gothic" w:cs="Malgun Gothic" w:eastAsia="Malgun Gothic" w:hAnsi="Malgun Gothic"/>
+                <w:b/>
+                <w:bCs/>
+                <w:sz w:val="19"/>
+                <w:szCs w:val="19"/>
+              </w:rPr>
+              <w:t xml:space="preserve">EC5 전원케이블 피그테일 10AWG 100mm 90A (암잭)</w:t>
+            </w:r>
+          </w:p>
+        </w:tc>
+        <w:tc>
+          <w:tcPr>
+            <w:tcW w:type="dxa" w:w="4000"/>
+            <w:tcBorders>
+              <w:top w:val="single" w:color="A6A6A6" w:sz="4"/>
+              <w:left w:val="single" w:color="A6A6A6" w:sz="4"/>
+              <w:bottom w:val="single" w:color="A6A6A6" w:sz="4"/>
+              <w:right w:val="single" w:color="A6A6A6" w:sz="4"/>
+            </w:tcBorders>
+            <w:tcMar>
+              <w:top w:type="dxa" w:w="60"/>
+              <w:left w:type="dxa" w:w="100"/>
+              <w:bottom w:type="dxa" w:w="60"/>
+              <w:right w:type="dxa" w:w="100"/>
+            </w:tcMar>
+          </w:tcPr>
+          <w:p>
+            <w:r>
+              <w:rPr>
+                <w:rFonts w:ascii="Malgun Gothic" w:cs="Malgun Gothic" w:eastAsia="Malgun Gothic" w:hAnsi="Malgun Gothic"/>
+                <w:sz w:val="19"/>
+                <w:szCs w:val="19"/>
+              </w:rPr>
+              <w:t xml:space="preserve">배터리 EC5 분기. 접촉기 앞에서 컨버터·인젝터·XL4015 입력을 따는 자리. 10-14 팀 추가. 3개 배정은 회로팀 확정</w:t>
+            </w:r>
+          </w:p>
+        </w:tc>
+        <w:tc>
+          <w:tcPr>
+            <w:tcW w:type="dxa" w:w="1100"/>
+            <w:tcBorders>
+              <w:top w:val="single" w:color="A6A6A6" w:sz="4"/>
+              <w:left w:val="single" w:color="A6A6A6" w:sz="4"/>
+              <w:bottom w:val="single" w:color="A6A6A6" w:sz="4"/>
+              <w:right w:val="single" w:color="A6A6A6" w:sz="4"/>
+            </w:tcBorders>
+            <w:tcMar>
+              <w:top w:type="dxa" w:w="60"/>
+              <w:left w:type="dxa" w:w="100"/>
+              <w:bottom w:type="dxa" w:w="60"/>
+              <w:right w:type="dxa" w:w="100"/>
+            </w:tcMar>
+          </w:tcPr>
+          <w:p>
+            <w:pPr>
+              <w:jc w:val="center"/>
+            </w:pPr>
+            <w:r>
+              <w:rPr>
+                <w:rFonts w:ascii="Malgun Gothic" w:cs="Malgun Gothic" w:eastAsia="Malgun Gothic" w:hAnsi="Malgun Gothic"/>
+                <w:sz w:val="19"/>
+                <w:szCs w:val="19"/>
+              </w:rPr>
+              <w:t xml:space="preserve">3</w:t>
+            </w:r>
+          </w:p>
+        </w:tc>
+        <w:tc>
+          <w:tcPr>
+            <w:tcW w:type="dxa" w:w="2300"/>
+            <w:tcBorders>
+              <w:top w:val="single" w:color="A6A6A6" w:sz="4"/>
+              <w:left w:val="single" w:color="A6A6A6" w:sz="4"/>
+              <w:bottom w:val="single" w:color="A6A6A6" w:sz="4"/>
+              <w:right w:val="single" w:color="A6A6A6" w:sz="4"/>
+            </w:tcBorders>
+            <w:tcMar>
+              <w:top w:type="dxa" w:w="60"/>
+              <w:left w:type="dxa" w:w="100"/>
+              <w:bottom w:type="dxa" w:w="60"/>
+              <w:right w:type="dxa" w:w="100"/>
+            </w:tcMar>
+          </w:tcPr>
+          <w:p>
+            <w:pPr>
+              <w:jc w:val="right"/>
+            </w:pPr>
+            <w:r>
+              <w:rPr>
+                <w:rFonts w:ascii="Malgun Gothic" w:cs="Malgun Gothic" w:eastAsia="Malgun Gothic" w:hAnsi="Malgun Gothic"/>
+                <w:sz w:val="19"/>
+                <w:szCs w:val="19"/>
+              </w:rPr>
+              <w:t xml:space="preserve">9,000 (개당 3,000)</w:t>
+            </w:r>
+          </w:p>
+        </w:tc>
+        <w:tc>
+          <w:tcPr>
+            <w:tcW w:type="dxa" w:w="700"/>
+            <w:tcBorders>
+              <w:top w:val="single" w:color="A6A6A6" w:sz="4"/>
+              <w:left w:val="single" w:color="A6A6A6" w:sz="4"/>
+              <w:bottom w:val="single" w:color="A6A6A6" w:sz="4"/>
+              <w:right w:val="single" w:color="A6A6A6" w:sz="4"/>
+            </w:tcBorders>
+            <w:tcMar>
+              <w:top w:type="dxa" w:w="60"/>
+              <w:left w:type="dxa" w:w="100"/>
+              <w:bottom w:type="dxa" w:w="60"/>
+              <w:right w:type="dxa" w:w="100"/>
+            </w:tcMar>
+          </w:tcPr>
+          <w:p>
+            <w:pPr>
+              <w:jc w:val="center"/>
+            </w:pPr>
+            <w:r>
+              <w:rPr>
+                <w:rFonts w:ascii="Malgun Gothic" w:cs="Malgun Gothic" w:eastAsia="Malgun Gothic" w:hAnsi="Malgun Gothic"/>
+                <w:b/>
+                <w:bCs/>
+                <w:color w:val="C00000"/>
+                <w:sz w:val="19"/>
+                <w:szCs w:val="19"/>
+              </w:rPr>
+              <w:t xml:space="preserve">P0</w:t>
+            </w:r>
+          </w:p>
+        </w:tc>
+        <w:tc>
+          <w:tcPr>
+            <w:tcW w:type="dxa" w:w="3470"/>
+            <w:tcBorders>
+              <w:top w:val="single" w:color="A6A6A6" w:sz="4"/>
+              <w:left w:val="single" w:color="A6A6A6" w:sz="4"/>
+              <w:bottom w:val="single" w:color="A6A6A6" w:sz="4"/>
+              <w:right w:val="single" w:color="A6A6A6" w:sz="4"/>
+            </w:tcBorders>
+            <w:tcMar>
+              <w:top w:type="dxa" w:w="60"/>
+              <w:left w:type="dxa" w:w="100"/>
+              <w:bottom w:type="dxa" w:w="60"/>
+              <w:right w:type="dxa" w:w="100"/>
+            </w:tcMar>
+          </w:tcPr>
+          <w:p>
+            <w:hyperlink w:history="1" r:id="rIdxzmnqlcbgovtanyoy6f79">
+              <w:r>
+                <w:rPr>
+                  <w:rStyle w:val="Hyperlink"/>
+                  <w:rFonts w:ascii="Malgun Gothic" w:cs="Malgun Gothic" w:eastAsia="Malgun Gothic" w:hAnsi="Malgun Gothic"/>
+                  <w:color w:val="0563C1"/>
+                  <w:sz w:val="19"/>
+                  <w:szCs w:val="19"/>
+                  <w:u w:val="single"/>
+                </w:rPr>
+                <w:t xml:space="preserve">쿠팡 로켓</w:t>
+              </w:r>
+            </w:hyperlink>
+          </w:p>
+        </w:tc>
+      </w:tr>
+      <w:tr>
+        <w:tc>
+          <w:tcPr>
+            <w:tcW w:type="dxa" w:w="3000"/>
+            <w:tcBorders>
+              <w:top w:val="single" w:color="A6A6A6" w:sz="4"/>
+              <w:left w:val="single" w:color="A6A6A6" w:sz="4"/>
+              <w:bottom w:val="single" w:color="A6A6A6" w:sz="4"/>
+              <w:right w:val="single" w:color="A6A6A6" w:sz="4"/>
+            </w:tcBorders>
+            <w:shd w:fill="F2F2F2" w:color="auto" w:val="clear"/>
+            <w:tcMar>
+              <w:top w:type="dxa" w:w="60"/>
+              <w:left w:type="dxa" w:w="100"/>
+              <w:bottom w:type="dxa" w:w="60"/>
+              <w:right w:type="dxa" w:w="100"/>
+            </w:tcMar>
+          </w:tcPr>
+          <w:p>
+            <w:r>
+              <w:rPr>
+                <w:rFonts w:ascii="Malgun Gothic" w:cs="Malgun Gothic" w:eastAsia="Malgun Gothic" w:hAnsi="Malgun Gothic"/>
+                <w:b/>
+                <w:bCs/>
+                <w:sz w:val="19"/>
+                <w:szCs w:val="19"/>
+              </w:rPr>
+              <w:t xml:space="preserve">소계</w:t>
+            </w:r>
+          </w:p>
+        </w:tc>
+        <w:tc>
+          <w:tcPr>
+            <w:tcW w:type="dxa" w:w="4000"/>
+            <w:tcBorders>
+              <w:top w:val="single" w:color="A6A6A6" w:sz="4"/>
+              <w:left w:val="single" w:color="A6A6A6" w:sz="4"/>
+              <w:bottom w:val="single" w:color="A6A6A6" w:sz="4"/>
+              <w:right w:val="single" w:color="A6A6A6" w:sz="4"/>
+            </w:tcBorders>
+            <w:shd w:fill="F2F2F2" w:color="auto" w:val="clear"/>
+            <w:tcMar>
+              <w:top w:type="dxa" w:w="60"/>
+              <w:left w:type="dxa" w:w="100"/>
+              <w:bottom w:type="dxa" w:w="60"/>
+              <w:right w:type="dxa" w:w="100"/>
+            </w:tcMar>
+          </w:tcPr>
+          <w:p>
+            <w:r>
+              <w:rPr>
+                <w:rFonts w:ascii="Malgun Gothic" w:cs="Malgun Gothic" w:eastAsia="Malgun Gothic" w:hAnsi="Malgun Gothic"/>
+                <w:sz w:val="19"/>
+                <w:szCs w:val="19"/>
+              </w:rPr>
+              <w:t xml:space="preserve"/>
+            </w:r>
+          </w:p>
+        </w:tc>
+        <w:tc>
+          <w:tcPr>
+            <w:tcW w:type="dxa" w:w="1100"/>
+            <w:tcBorders>
+              <w:top w:val="single" w:color="A6A6A6" w:sz="4"/>
+              <w:left w:val="single" w:color="A6A6A6" w:sz="4"/>
+              <w:bottom w:val="single" w:color="A6A6A6" w:sz="4"/>
+              <w:right w:val="single" w:color="A6A6A6" w:sz="4"/>
+            </w:tcBorders>
+            <w:shd w:fill="F2F2F2" w:color="auto" w:val="clear"/>
+            <w:tcMar>
+              <w:top w:type="dxa" w:w="60"/>
+              <w:left w:type="dxa" w:w="100"/>
+              <w:bottom w:type="dxa" w:w="60"/>
+              <w:right w:type="dxa" w:w="100"/>
+            </w:tcMar>
+          </w:tcPr>
+          <w:p>
+            <w:r>
+              <w:rPr>
+                <w:rFonts w:ascii="Malgun Gothic" w:cs="Malgun Gothic" w:eastAsia="Malgun Gothic" w:hAnsi="Malgun Gothic"/>
+                <w:sz w:val="19"/>
+                <w:szCs w:val="19"/>
+              </w:rPr>
+              <w:t xml:space="preserve"/>
+            </w:r>
+          </w:p>
+        </w:tc>
+        <w:tc>
+          <w:tcPr>
+            <w:tcW w:type="dxa" w:w="2300"/>
+            <w:tcBorders>
+              <w:top w:val="single" w:color="A6A6A6" w:sz="4"/>
+              <w:left w:val="single" w:color="A6A6A6" w:sz="4"/>
+              <w:bottom w:val="single" w:color="A6A6A6" w:sz="4"/>
+              <w:right w:val="single" w:color="A6A6A6" w:sz="4"/>
+            </w:tcBorders>
+            <w:shd w:fill="F2F2F2" w:color="auto" w:val="clear"/>
+            <w:tcMar>
+              <w:top w:type="dxa" w:w="60"/>
+              <w:left w:type="dxa" w:w="100"/>
+              <w:bottom w:type="dxa" w:w="60"/>
+              <w:right w:type="dxa" w:w="100"/>
+            </w:tcMar>
+          </w:tcPr>
+          <w:p>
+            <w:pPr>
+              <w:jc w:val="right"/>
+            </w:pPr>
+            <w:r>
+              <w:rPr>
+                <w:rFonts w:ascii="Malgun Gothic" w:cs="Malgun Gothic" w:eastAsia="Malgun Gothic" w:hAnsi="Malgun Gothic"/>
+                <w:b/>
+                <w:bCs/>
+                <w:sz w:val="19"/>
+                <w:szCs w:val="19"/>
+              </w:rPr>
+              <w:t xml:space="preserve">9,000</w:t>
+            </w:r>
+          </w:p>
+        </w:tc>
+        <w:tc>
+          <w:tcPr>
+            <w:tcW w:type="dxa" w:w="700"/>
+            <w:tcBorders>
+              <w:top w:val="single" w:color="A6A6A6" w:sz="4"/>
+              <w:left w:val="single" w:color="A6A6A6" w:sz="4"/>
+              <w:bottom w:val="single" w:color="A6A6A6" w:sz="4"/>
+              <w:right w:val="single" w:color="A6A6A6" w:sz="4"/>
+            </w:tcBorders>
+            <w:shd w:fill="F2F2F2" w:color="auto" w:val="clear"/>
+            <w:tcMar>
+              <w:top w:type="dxa" w:w="60"/>
+              <w:left w:type="dxa" w:w="100"/>
+              <w:bottom w:type="dxa" w:w="60"/>
+              <w:right w:type="dxa" w:w="100"/>
+            </w:tcMar>
+          </w:tcPr>
+          <w:p>
+            <w:r>
+              <w:rPr>
+                <w:rFonts w:ascii="Malgun Gothic" w:cs="Malgun Gothic" w:eastAsia="Malgun Gothic" w:hAnsi="Malgun Gothic"/>
+                <w:sz w:val="19"/>
+                <w:szCs w:val="19"/>
+              </w:rPr>
+              <w:t xml:space="preserve"/>
+            </w:r>
+          </w:p>
+        </w:tc>
+        <w:tc>
+          <w:tcPr>
+            <w:tcW w:type="dxa" w:w="3470"/>
+            <w:tcBorders>
+              <w:top w:val="single" w:color="A6A6A6" w:sz="4"/>
+              <w:left w:val="single" w:color="A6A6A6" w:sz="4"/>
+              <w:bottom w:val="single" w:color="A6A6A6" w:sz="4"/>
+              <w:right w:val="single" w:color="A6A6A6" w:sz="4"/>
+            </w:tcBorders>
+            <w:shd w:fill="F2F2F2" w:color="auto" w:val="clear"/>
+            <w:tcMar>
+              <w:top w:type="dxa" w:w="60"/>
+              <w:left w:type="dxa" w:w="100"/>
+              <w:bottom w:type="dxa" w:w="60"/>
+              <w:right w:type="dxa" w:w="100"/>
+            </w:tcMar>
+          </w:tcPr>
+          <w:p>
+            <w:r>
+              <w:rPr>
+                <w:rFonts w:ascii="Malgun Gothic" w:cs="Malgun Gothic" w:eastAsia="Malgun Gothic" w:hAnsi="Malgun Gothic"/>
+                <w:sz w:val="19"/>
+                <w:szCs w:val="19"/>
+              </w:rPr>
+              <w:t xml:space="preserve"/>
+            </w:r>
+          </w:p>
+        </w:tc>
+      </w:tr>
+    </w:tbl>
+    <w:p>
+      <w:pPr>
+        <w:spacing w:after="80" w:before="80"/>
+      </w:pPr>
+      <w:r>
+        <w:rPr>
+          <w:rFonts w:ascii="Malgun Gothic" w:cs="Malgun Gothic" w:eastAsia="Malgun Gothic" w:hAnsi="Malgun Gothic"/>
+          <w:sz w:val="18"/>
+          <w:szCs w:val="18"/>
+        </w:rPr>
+        <w:t xml:space="preserve">본선(배터리↔ESC)은 08-25 에 끝났다. 이건 접촉기 앞에서 보조 전원을 따기 위한 분기 커넥터다. 옵션은 암잭 — 배터리 쪽 EC5 수컷에 꽂는다.</w:t>
       </w:r>
     </w:p>
     <w:p>
@@ -6859,7 +7601,7 @@
             </w:tcMar>
           </w:tcPr>
           <w:p>
-            <w:hyperlink w:history="1" r:id="rId5rjli1dl4ppxyswkfesq0">
+            <w:hyperlink w:history="1" r:id="rId4qb_d4hklshealocu7bha">
               <w:r>
                 <w:rPr>
                   <w:rStyle w:val="Hyperlink"/>
@@ -7410,7 +8152,7 @@
                 <w:sz w:val="19"/>
                 <w:szCs w:val="19"/>
               </w:rPr>
-              <w:t xml:space="preserve">F. 주 전력</w:t>
+              <w:t xml:space="preserve">F. 주 전력 본선</w:t>
             </w:r>
           </w:p>
         </w:tc>
@@ -7439,7 +8181,7 @@
                 <w:sz w:val="19"/>
                 <w:szCs w:val="19"/>
               </w:rPr>
-              <w:t xml:space="preserve">08-25 재배선 끝, 09-07 물 위 시험 통과</w:t>
+              <w:t xml:space="preserve">08-25 재배선 끝, 09-07 물 위 시험 통과 (분기 피그테일만 위 F 에서 구매)</w:t>
             </w:r>
           </w:p>
         </w:tc>
@@ -8030,7 +8772,7 @@
                 <w:sz w:val="24"/>
                 <w:szCs w:val="24"/>
               </w:rPr>
-              <w:t xml:space="preserve">1,667,540 ~ 1,686,540</w:t>
+              <w:t xml:space="preserve">1,676,540 ~ 1,695,540</w:t>
             </w:r>
           </w:p>
         </w:tc>
@@ -8057,7 +8799,7 @@
                 <w:sz w:val="19"/>
                 <w:szCs w:val="19"/>
               </w:rPr>
-              <w:t xml:space="preserve">10항목 전체</w:t>
+              <w:t xml:space="preserve">11항목 전체</w:t>
             </w:r>
           </w:p>
         </w:tc>
@@ -8212,7 +8954,7 @@
                 <w:sz w:val="24"/>
                 <w:szCs w:val="24"/>
               </w:rPr>
-              <w:t xml:space="preserve">260,340 ~ 279,340</w:t>
+              <w:t xml:space="preserve">269,340 ~ 288,340</w:t>
             </w:r>
           </w:p>
         </w:tc>
@@ -8239,7 +8981,7 @@
                 <w:sz w:val="19"/>
                 <w:szCs w:val="19"/>
               </w:rPr>
-              <w:t xml:space="preserve">나머지 7항목 — 우리가 내야 하는 금액</w:t>
+              <w:t xml:space="preserve">나머지 8항목 — 우리가 내야 하는 금액</w:t>
             </w:r>
           </w:p>
         </w:tc>
@@ -9597,6 +10339,104 @@
               <w:bottom w:val="single" w:color="A6A6A6" w:sz="4"/>
               <w:right w:val="single" w:color="A6A6A6" w:sz="4"/>
             </w:tcBorders>
+            <w:tcMar>
+              <w:top w:type="dxa" w:w="60"/>
+              <w:left w:type="dxa" w:w="100"/>
+              <w:bottom w:type="dxa" w:w="60"/>
+              <w:right w:type="dxa" w:w="100"/>
+            </w:tcMar>
+          </w:tcPr>
+          <w:p>
+            <w:pPr>
+              <w:jc w:val="left"/>
+            </w:pPr>
+            <w:r>
+              <w:rPr>
+                <w:rFonts w:ascii="Malgun Gothic" w:cs="Malgun Gothic" w:eastAsia="Malgun Gothic" w:hAnsi="Malgun Gothic"/>
+                <w:b/>
+                <w:bCs/>
+                <w:sz w:val="19"/>
+                <w:szCs w:val="19"/>
+              </w:rPr>
+              <w:t xml:space="preserve">EC5 피그테일 ×3</w:t>
+            </w:r>
+          </w:p>
+        </w:tc>
+        <w:tc>
+          <w:tcPr>
+            <w:tcW w:type="dxa" w:w="3800"/>
+            <w:tcBorders>
+              <w:top w:val="single" w:color="A6A6A6" w:sz="4"/>
+              <w:left w:val="single" w:color="A6A6A6" w:sz="4"/>
+              <w:bottom w:val="single" w:color="A6A6A6" w:sz="4"/>
+              <w:right w:val="single" w:color="A6A6A6" w:sz="4"/>
+            </w:tcBorders>
+            <w:tcMar>
+              <w:top w:type="dxa" w:w="60"/>
+              <w:left w:type="dxa" w:w="100"/>
+              <w:bottom w:type="dxa" w:w="60"/>
+              <w:right w:type="dxa" w:w="100"/>
+            </w:tcMar>
+          </w:tcPr>
+          <w:p>
+            <w:pPr>
+              <w:jc w:val="right"/>
+            </w:pPr>
+            <w:r>
+              <w:rPr>
+                <w:rFonts w:ascii="Malgun Gothic" w:cs="Malgun Gothic" w:eastAsia="Malgun Gothic" w:hAnsi="Malgun Gothic"/>
+                <w:b w:val="false"/>
+                <w:bCs w:val="false"/>
+                <w:sz w:val="19"/>
+                <w:szCs w:val="19"/>
+              </w:rPr>
+              <w:t xml:space="preserve">9,000</w:t>
+            </w:r>
+          </w:p>
+        </w:tc>
+        <w:tc>
+          <w:tcPr>
+            <w:tcW w:type="dxa" w:w="6570"/>
+            <w:tcBorders>
+              <w:top w:val="single" w:color="A6A6A6" w:sz="4"/>
+              <w:left w:val="single" w:color="A6A6A6" w:sz="4"/>
+              <w:bottom w:val="single" w:color="A6A6A6" w:sz="4"/>
+              <w:right w:val="single" w:color="A6A6A6" w:sz="4"/>
+            </w:tcBorders>
+            <w:tcMar>
+              <w:top w:type="dxa" w:w="60"/>
+              <w:left w:type="dxa" w:w="100"/>
+              <w:bottom w:type="dxa" w:w="60"/>
+              <w:right w:type="dxa" w:w="100"/>
+            </w:tcMar>
+          </w:tcPr>
+          <w:p>
+            <w:pPr>
+              <w:jc w:val="left"/>
+            </w:pPr>
+            <w:r>
+              <w:rPr>
+                <w:rFonts w:ascii="Malgun Gothic" w:cs="Malgun Gothic" w:eastAsia="Malgun Gothic" w:hAnsi="Malgun Gothic"/>
+                <w:b w:val="false"/>
+                <w:bCs w:val="false"/>
+                <w:sz w:val="19"/>
+                <w:szCs w:val="19"/>
+              </w:rPr>
+              <w:t xml:space="preserve">F. 주 전력</w:t>
+            </w:r>
+          </w:p>
+        </w:tc>
+      </w:tr>
+      <w:tr>
+        <w:tc>
+          <w:tcPr>
+            <w:tcW w:type="dxa" w:w="4200"/>
+            <w:tcBorders>
+              <w:top w:val="single" w:color="A6A6A6" w:sz="4"/>
+              <w:left w:val="single" w:color="A6A6A6" w:sz="4"/>
+              <w:bottom w:val="single" w:color="A6A6A6" w:sz="4"/>
+              <w:right w:val="single" w:color="A6A6A6" w:sz="4"/>
+            </w:tcBorders>
             <w:shd w:fill="F2F2F2" w:color="auto" w:val="clear"/>
             <w:tcMar>
               <w:top w:type="dxa" w:w="60"/>
@@ -9650,7 +10490,7 @@
                 <w:sz w:val="19"/>
                 <w:szCs w:val="19"/>
               </w:rPr>
-              <w:t xml:space="preserve">260,340 ~ 279,340</w:t>
+              <w:t xml:space="preserve">269,340 ~ 288,340</w:t>
             </w:r>
           </w:p>
         </w:tc>

</xml_diff>

<commit_message>
docs(구매): 5x20 퓨즈 2A·3A 각 2→10개 (1회용, 예비 0 이었다) — 7,400, 합계 1,678,300~1,697,300
Co-Authored-By: Claude Fable 5.1 <noreply@anthropic.com>
</commit_message>
<xml_diff>
--- a/docs/전달용/SSF2026_구매목록_계통별.docx
+++ b/docs/전달용/SSF2026_구매목록_계통별.docx
@@ -282,7 +282,7 @@
                 <w:sz w:val="19"/>
                 <w:szCs w:val="19"/>
               </w:rPr>
-              <w:t xml:space="preserve">1,507,220</w:t>
+              <w:t xml:space="preserve">1,508,100</w:t>
             </w:r>
           </w:p>
         </w:tc>
@@ -802,7 +802,7 @@
                 <w:sz w:val="19"/>
                 <w:szCs w:val="19"/>
               </w:rPr>
-              <w:t xml:space="preserve">33,720 ~ 37,720</w:t>
+              <w:t xml:space="preserve">34,600 ~ 38,600</w:t>
             </w:r>
           </w:p>
         </w:tc>
@@ -1195,7 +1195,7 @@
                 <w:sz w:val="19"/>
                 <w:szCs w:val="19"/>
               </w:rPr>
-              <w:t xml:space="preserve">1,676,540 ~ 1,695,540</w:t>
+              <w:t xml:space="preserve">1,678,300 ~ 1,697,300</w:t>
             </w:r>
           </w:p>
         </w:tc>
@@ -1639,7 +1639,7 @@
             </w:tcMar>
           </w:tcPr>
           <w:p>
-            <w:hyperlink w:history="1" r:id="rIdynnmhliyqgndgrqn1lxft">
+            <w:hyperlink w:history="1" r:id="rIdh1tpdbuobcuae0vyn8clq">
               <w:r>
                 <w:rPr>
                   <w:rStyle w:val="Hyperlink"/>
@@ -1822,7 +1822,7 @@
             </w:tcMar>
           </w:tcPr>
           <w:p>
-            <w:hyperlink w:history="1" r:id="rIdcdzsaxbt4jwix_xz_7fdb">
+            <w:hyperlink w:history="1" r:id="rIdsjeudafxqmwaeocu_kbjk">
               <w:r>
                 <w:rPr>
                   <w:rStyle w:val="Hyperlink"/>
@@ -1843,7 +1843,7 @@
               </w:rPr>
               <w:t xml:space="preserve"> · </w:t>
             </w:r>
-            <w:hyperlink w:history="1" r:id="rIdvi3ssagv1oritp6xkjpjc">
+            <w:hyperlink w:history="1" r:id="rIdcw_5vfesj-qd1enc-rgjc">
               <w:r>
                 <w:rPr>
                   <w:rStyle w:val="Hyperlink"/>
@@ -2026,7 +2026,7 @@
             </w:tcMar>
           </w:tcPr>
           <w:p>
-            <w:hyperlink w:history="1" r:id="rId5mv4prlzyc9bhekaxkuym">
+            <w:hyperlink w:history="1" r:id="rIdzjtdkycpygxsvsdhvcfxo">
               <w:r>
                 <w:rPr>
                   <w:rStyle w:val="Hyperlink"/>
@@ -2095,7 +2095,7 @@
                 <w:sz w:val="19"/>
                 <w:szCs w:val="19"/>
               </w:rPr>
-              <w:t xml:space="preserve">인젝터 입력 보호. 배터리 ⊕ 와 인젝터 사이</w:t>
+              <w:t xml:space="preserve">인젝터 입력 보호. 배터리 ⊕ 와 인젝터 사이. 퓨즈는 1회용이라 예비 포함 10개(10-14)</w:t>
             </w:r>
           </w:p>
         </w:tc>
@@ -2125,7 +2125,7 @@
                 <w:sz w:val="19"/>
                 <w:szCs w:val="19"/>
               </w:rPr>
-              <w:t xml:space="preserve">홀더 2 · 퓨즈 2</w:t>
+              <w:t xml:space="preserve">홀더 2 · 퓨즈 10</w:t>
             </w:r>
           </w:p>
         </w:tc>
@@ -2155,7 +2155,7 @@
                 <w:sz w:val="19"/>
                 <w:szCs w:val="19"/>
               </w:rPr>
-              <w:t xml:space="preserve">2,820</w:t>
+              <w:t xml:space="preserve">3,700</w:t>
             </w:r>
           </w:p>
         </w:tc>
@@ -2209,7 +2209,7 @@
             </w:tcMar>
           </w:tcPr>
           <w:p>
-            <w:hyperlink w:history="1" r:id="rIdlq1vejzkc-ikvsbn_tcvj">
+            <w:hyperlink w:history="1" r:id="rIdo3l2rj6ryahywr60opjff">
               <w:r>
                 <w:rPr>
                   <w:rStyle w:val="Hyperlink"/>
@@ -2230,7 +2230,7 @@
               </w:rPr>
               <w:t xml:space="preserve"> · </w:t>
             </w:r>
-            <w:hyperlink w:history="1" r:id="rIdp2nsgnjplxxjsgmtjkpo3">
+            <w:hyperlink w:history="1" r:id="rIdlmmz6_jgsxdnohbt-vkb2">
               <w:r>
                 <w:rPr>
                   <w:rStyle w:val="Hyperlink"/>
@@ -2362,7 +2362,7 @@
                 <w:sz w:val="19"/>
                 <w:szCs w:val="19"/>
               </w:rPr>
-              <w:t xml:space="preserve">1,507,220</w:t>
+              <w:t xml:space="preserve">1,508,100</w:t>
             </w:r>
           </w:p>
         </w:tc>
@@ -4516,7 +4516,7 @@
             </w:tcMar>
           </w:tcPr>
           <w:p>
-            <w:hyperlink w:history="1" r:id="rIdnzdezdjuwyfr-uf3_f6on">
+            <w:hyperlink w:history="1" r:id="rIdjwnq35qbivgeefmfbz8ml">
               <w:r>
                 <w:rPr>
                   <w:rStyle w:val="Hyperlink"/>
@@ -4537,7 +4537,7 @@
               </w:rPr>
               <w:t xml:space="preserve"> · </w:t>
             </w:r>
-            <w:hyperlink w:history="1" r:id="rId088npgs21cpwux6rrxq_r">
+            <w:hyperlink w:history="1" r:id="rIdqzz84eozdrf0fle8sztpo">
               <w:r>
                 <w:rPr>
                   <w:rStyle w:val="Hyperlink"/>
@@ -5174,7 +5174,7 @@
             </w:tcMar>
           </w:tcPr>
           <w:p>
-            <w:hyperlink w:history="1" r:id="rIdt_39vicl2cghctokzhoyl">
+            <w:hyperlink w:history="1" r:id="rIdmvzmitzpi2gakzffbl7kf">
               <w:r>
                 <w:rPr>
                   <w:rStyle w:val="Hyperlink"/>
@@ -5357,7 +5357,7 @@
             </w:tcMar>
           </w:tcPr>
           <w:p>
-            <w:hyperlink w:history="1" r:id="rIdfsjmlsraip7z76k3osqen">
+            <w:hyperlink w:history="1" r:id="rIdsnelrybw8th32vfnndiot">
               <w:r>
                 <w:rPr>
                   <w:rStyle w:val="Hyperlink"/>
@@ -5969,7 +5969,7 @@
             </w:tcMar>
           </w:tcPr>
           <w:p>
-            <w:hyperlink w:history="1" r:id="rIdbjmpzxcadawhbro8gbilm">
+            <w:hyperlink w:history="1" r:id="rId716hdp1pcxqwvs2lgbcmt">
               <w:r>
                 <w:rPr>
                   <w:rStyle w:val="Hyperlink"/>
@@ -5990,7 +5990,7 @@
               </w:rPr>
               <w:t xml:space="preserve"> · </w:t>
             </w:r>
-            <w:hyperlink w:history="1" r:id="rIdh76x3soiectmgnn-nv1si">
+            <w:hyperlink w:history="1" r:id="rId4byeodxmsnb9rypgns8at">
               <w:r>
                 <w:rPr>
                   <w:rStyle w:val="Hyperlink"/>
@@ -6173,7 +6173,7 @@
             </w:tcMar>
           </w:tcPr>
           <w:p>
-            <w:hyperlink w:history="1" r:id="rIdxh58gvkdltbzwf3gmu4gb">
+            <w:hyperlink w:history="1" r:id="rIdubxml4d17ofuqwmdn2qc9">
               <w:r>
                 <w:rPr>
                   <w:rStyle w:val="Hyperlink"/>
@@ -6242,7 +6242,7 @@
                 <w:sz w:val="19"/>
                 <w:szCs w:val="19"/>
               </w:rPr>
-              <w:t xml:space="preserve">허브 급전(XL4015 입력) 보호 + 예비 1</w:t>
+              <w:t xml:space="preserve">허브 급전(XL4015 입력) 보호. 퓨즈는 1회용이라 예비 포함 10개(10-14)</w:t>
             </w:r>
           </w:p>
         </w:tc>
@@ -6272,7 +6272,7 @@
                 <w:sz w:val="19"/>
                 <w:szCs w:val="19"/>
               </w:rPr>
-              <w:t xml:space="preserve">홀더 2 · 퓨즈 2</w:t>
+              <w:t xml:space="preserve">홀더 2 · 퓨즈 10</w:t>
             </w:r>
           </w:p>
         </w:tc>
@@ -6302,7 +6302,7 @@
                 <w:sz w:val="19"/>
                 <w:szCs w:val="19"/>
               </w:rPr>
-              <w:t xml:space="preserve">2,820</w:t>
+              <w:t xml:space="preserve">3,700</w:t>
             </w:r>
           </w:p>
         </w:tc>
@@ -6356,7 +6356,7 @@
             </w:tcMar>
           </w:tcPr>
           <w:p>
-            <w:hyperlink w:history="1" r:id="rIdrppyai1yadjpuzqunyzhq">
+            <w:hyperlink w:history="1" r:id="rIds-cyfpepb4vjqxlvfjyit">
               <w:r>
                 <w:rPr>
                   <w:rStyle w:val="Hyperlink"/>
@@ -6377,7 +6377,7 @@
               </w:rPr>
               <w:t xml:space="preserve"> · </w:t>
             </w:r>
-            <w:hyperlink w:history="1" r:id="rIddkmony9pukhghkxieomb-">
+            <w:hyperlink w:history="1" r:id="rIdvsotynbhbqtc-7cfjf6iy">
               <w:r>
                 <w:rPr>
                   <w:rStyle w:val="Hyperlink"/>
@@ -6509,7 +6509,7 @@
                 <w:sz w:val="19"/>
                 <w:szCs w:val="19"/>
               </w:rPr>
-              <w:t xml:space="preserve">33,720 ~ 37,720</w:t>
+              <w:t xml:space="preserve">34,600 ~ 38,600</w:t>
             </w:r>
           </w:p>
         </w:tc>
@@ -6989,7 +6989,7 @@
             </w:tcMar>
           </w:tcPr>
           <w:p>
-            <w:hyperlink w:history="1" r:id="rIdxzmnqlcbgovtanyoy6f79">
+            <w:hyperlink w:history="1" r:id="rId0n0o6w17lg5lr0hkdjink">
               <w:r>
                 <w:rPr>
                   <w:rStyle w:val="Hyperlink"/>
@@ -7601,7 +7601,7 @@
             </w:tcMar>
           </w:tcPr>
           <w:p>
-            <w:hyperlink w:history="1" r:id="rId4qb_d4hklshealocu7bha">
+            <w:hyperlink w:history="1" r:id="rId-x7foxqpyznpcjxiczfil">
               <w:r>
                 <w:rPr>
                   <w:rStyle w:val="Hyperlink"/>
@@ -7907,7 +7907,7 @@
           <w:sz w:val="19"/>
           <w:szCs w:val="19"/>
         </w:rPr>
-        <w:t xml:space="preserve">BF303 홀더가 도착하면 5x20 퓨즈를 끼워 본다. 안 맞으면 F-520 클립(110원)을 전선에 납땜한다.</w:t>
+        <w:t xml:space="preserve">BF303 홀더가 도착하면 5x20 퓨즈를 끼워 본다. 안 맞으면 F-520 클립(110원)을 전선에 납땜한다. 예비 퓨즈는 배에 항상 2A·3A 몇 개씩 싣는다.</w:t>
       </w:r>
     </w:p>
     <w:p>
@@ -8772,7 +8772,7 @@
                 <w:sz w:val="24"/>
                 <w:szCs w:val="24"/>
               </w:rPr>
-              <w:t xml:space="preserve">1,676,540 ~ 1,695,540</w:t>
+              <w:t xml:space="preserve">1,678,300 ~ 1,697,300</w:t>
             </w:r>
           </w:p>
         </w:tc>
@@ -8954,7 +8954,7 @@
                 <w:sz w:val="24"/>
                 <w:szCs w:val="24"/>
               </w:rPr>
-              <w:t xml:space="preserve">269,340 ~ 288,340</w:t>
+              <w:t xml:space="preserve">271,100 ~ 290,100</w:t>
             </w:r>
           </w:p>
         </w:tc>
@@ -10260,7 +10260,7 @@
                 <w:sz w:val="19"/>
                 <w:szCs w:val="19"/>
               </w:rPr>
-              <w:t xml:space="preserve">퓨즈홀더 ×4 + 퓨즈 ×4</w:t>
+              <w:t xml:space="preserve">퓨즈홀더 ×4 + 퓨즈 2A×10·3A×10</w:t>
             </w:r>
           </w:p>
         </w:tc>
@@ -10292,7 +10292,7 @@
                 <w:sz w:val="19"/>
                 <w:szCs w:val="19"/>
               </w:rPr>
-              <w:t xml:space="preserve">5,640</w:t>
+              <w:t xml:space="preserve">7,400</w:t>
             </w:r>
           </w:p>
         </w:tc>
@@ -10490,7 +10490,7 @@
                 <w:sz w:val="19"/>
                 <w:szCs w:val="19"/>
               </w:rPr>
-              <w:t xml:space="preserve">269,340 ~ 288,340</w:t>
+              <w:t xml:space="preserve">271,100 ~ 290,100</w:t>
             </w:r>
           </w:p>
         </w:tc>

</xml_diff>

<commit_message>
docs(구매): Mega 구매처 디바이스마트 no=34405 로 확정 (정품 A000067, 64,900, 1~2일) — 한 장바구니 126,600 무료배송, 합계 1,696,820~1,711,820
Co-Authored-By: Claude Fable 5.1 <noreply@anthropic.com>
</commit_message>
<xml_diff>
--- a/docs/전달용/SSF2026_구매목록_계통별.docx
+++ b/docs/전달용/SSF2026_구매목록_계통별.docx
@@ -39,7 +39,7 @@
           <w:sz w:val="19"/>
           <w:szCs w:val="19"/>
         </w:rPr>
-        <w:t xml:space="preserve">사야 할 것은 11항목, 합계 약 169~170만원이다. 아직 하나도 주문하지 않았다. 같은 계통 안에서 하나만 빠져도 그 계통은 안 돈다.</w:t>
+        <w:t xml:space="preserve">사야 할 것은 11항목, 합계 약 170~171만원이다. 아직 하나도 주문하지 않았다. 같은 계통 안에서 하나만 빠져도 그 계통은 안 돈다.</w:t>
       </w:r>
     </w:p>
     <w:tbl>
@@ -1062,7 +1062,7 @@
                 <w:sz w:val="19"/>
                 <w:szCs w:val="19"/>
               </w:rPr>
-              <w:t xml:space="preserve">58,000</w:t>
+              <w:t xml:space="preserve">64,900</w:t>
             </w:r>
           </w:p>
         </w:tc>
@@ -1195,7 +1195,7 @@
                 <w:sz w:val="19"/>
                 <w:szCs w:val="19"/>
               </w:rPr>
-              <w:t xml:space="preserve">1,689,920 ~ 1,704,920</w:t>
+              <w:t xml:space="preserve">1,696,820 ~ 1,711,820</w:t>
             </w:r>
           </w:p>
         </w:tc>
@@ -1228,7 +1228,7 @@
                 <w:sz w:val="19"/>
                 <w:szCs w:val="19"/>
               </w:rPr>
-              <w:t xml:space="preserve">OAK 2대가 78%</w:t>
+              <w:t xml:space="preserve">OAK 2대가 77~78%</w:t>
             </w:r>
           </w:p>
         </w:tc>
@@ -1639,7 +1639,7 @@
             </w:tcMar>
           </w:tcPr>
           <w:p>
-            <w:hyperlink w:history="1" r:id="rId_tnjzcxrqg08nmfrbn3hw">
+            <w:hyperlink w:history="1" r:id="rIdnffgfiuwmz0ipmuw9fyzv">
               <w:r>
                 <w:rPr>
                   <w:rStyle w:val="Hyperlink"/>
@@ -1822,7 +1822,7 @@
             </w:tcMar>
           </w:tcPr>
           <w:p>
-            <w:hyperlink w:history="1" r:id="rIdniaqh5zu5ns25kmce2krc">
+            <w:hyperlink w:history="1" r:id="rIdd-kb-u3ec4j_0oprd-g9-">
               <w:r>
                 <w:rPr>
                   <w:rStyle w:val="Hyperlink"/>
@@ -1843,7 +1843,7 @@
               </w:rPr>
               <w:t xml:space="preserve"> · </w:t>
             </w:r>
-            <w:hyperlink w:history="1" r:id="rIdr8pw9ybpoxldmymsx08xk">
+            <w:hyperlink w:history="1" r:id="rId1ioxllalnwxfhr-giaofb">
               <w:r>
                 <w:rPr>
                   <w:rStyle w:val="Hyperlink"/>
@@ -2026,7 +2026,7 @@
             </w:tcMar>
           </w:tcPr>
           <w:p>
-            <w:hyperlink w:history="1" r:id="rIdvt2z_nmgcxgkdkszqy1nf">
+            <w:hyperlink w:history="1" r:id="rIdo60jshb5gcrsmpbd_bh25">
               <w:r>
                 <w:rPr>
                   <w:rStyle w:val="Hyperlink"/>
@@ -2209,7 +2209,7 @@
             </w:tcMar>
           </w:tcPr>
           <w:p>
-            <w:hyperlink w:history="1" r:id="rId4bj8zsm0o_5jngwvisdib">
+            <w:hyperlink w:history="1" r:id="rIdqxcvyre0ovwldns6nabqk">
               <w:r>
                 <w:rPr>
                   <w:rStyle w:val="Hyperlink"/>
@@ -2230,7 +2230,7 @@
               </w:rPr>
               <w:t xml:space="preserve"> · </w:t>
             </w:r>
-            <w:hyperlink w:history="1" r:id="rIdzspdej9jg-wl92ojyqkzd">
+            <w:hyperlink w:history="1" r:id="rIdot6i7glrpfa7n4tam1tek">
               <w:r>
                 <w:rPr>
                   <w:rStyle w:val="Hyperlink"/>
@@ -4516,7 +4516,7 @@
             </w:tcMar>
           </w:tcPr>
           <w:p>
-            <w:hyperlink w:history="1" r:id="rIdfskm6tfllmp5gtc01ynfn">
+            <w:hyperlink w:history="1" r:id="rId8a1yesr-k5upiagsw2tnh">
               <w:r>
                 <w:rPr>
                   <w:rStyle w:val="Hyperlink"/>
@@ -4537,7 +4537,7 @@
               </w:rPr>
               <w:t xml:space="preserve"> · </w:t>
             </w:r>
-            <w:hyperlink w:history="1" r:id="rIdooedze1pnlbfh9uhpmumf">
+            <w:hyperlink w:history="1" r:id="rIdwzm28qkurpk2n0qv-4kml">
               <w:r>
                 <w:rPr>
                   <w:rStyle w:val="Hyperlink"/>
@@ -5174,7 +5174,7 @@
             </w:tcMar>
           </w:tcPr>
           <w:p>
-            <w:hyperlink w:history="1" r:id="rIduhqfiy9eod2iz9c11dxaq">
+            <w:hyperlink w:history="1" r:id="rIdi_bnn7cjqjlgrn-a38zbv">
               <w:r>
                 <w:rPr>
                   <w:rStyle w:val="Hyperlink"/>
@@ -5357,7 +5357,7 @@
             </w:tcMar>
           </w:tcPr>
           <w:p>
-            <w:hyperlink w:history="1" r:id="rId-29kwh3iv5iqkz3zd1bwt">
+            <w:hyperlink w:history="1" r:id="rIdatsitgnq4cwarei8nw-sp">
               <w:r>
                 <w:rPr>
                   <w:rStyle w:val="Hyperlink"/>
@@ -5969,7 +5969,7 @@
             </w:tcMar>
           </w:tcPr>
           <w:p>
-            <w:hyperlink w:history="1" r:id="rIdag8icfowmftscn87px78d">
+            <w:hyperlink w:history="1" r:id="rIdylupf8akdalmgztpsgmfc">
               <w:r>
                 <w:rPr>
                   <w:rStyle w:val="Hyperlink"/>
@@ -5990,7 +5990,7 @@
               </w:rPr>
               <w:t xml:space="preserve"> · </w:t>
             </w:r>
-            <w:hyperlink w:history="1" r:id="rIdz137vqkfoa2rbpxazsf-r">
+            <w:hyperlink w:history="1" r:id="rIdpgwgrj-vz4mmfydeu46ky">
               <w:r>
                 <w:rPr>
                   <w:rStyle w:val="Hyperlink"/>
@@ -6173,7 +6173,7 @@
             </w:tcMar>
           </w:tcPr>
           <w:p>
-            <w:hyperlink w:history="1" r:id="rIdai93u-3esg6vaugo45qu2">
+            <w:hyperlink w:history="1" r:id="rIdil2xpakbss-koli8vw6jc">
               <w:r>
                 <w:rPr>
                   <w:rStyle w:val="Hyperlink"/>
@@ -6194,7 +6194,7 @@
               </w:rPr>
               <w:t xml:space="preserve"> · </w:t>
             </w:r>
-            <w:hyperlink w:history="1" r:id="rId4j3j8tjrkrxq1esh0o9uo">
+            <w:hyperlink w:history="1" r:id="rId44g5nqscptj-jugea4f-3">
               <w:r>
                 <w:rPr>
                   <w:rStyle w:val="Hyperlink"/>
@@ -6377,7 +6377,7 @@
             </w:tcMar>
           </w:tcPr>
           <w:p>
-            <w:hyperlink w:history="1" r:id="rId0azd9czgaum9tnubypotr">
+            <w:hyperlink w:history="1" r:id="rIdmbgblkkjnvlfaacmntql5">
               <w:r>
                 <w:rPr>
                   <w:rStyle w:val="Hyperlink"/>
@@ -6398,7 +6398,7 @@
               </w:rPr>
               <w:t xml:space="preserve"> · </w:t>
             </w:r>
-            <w:hyperlink w:history="1" r:id="rIdhzd2zhbg78px3sobdfwns">
+            <w:hyperlink w:history="1" r:id="rId8g6r4znyi1l-d6mmyo_no">
               <w:r>
                 <w:rPr>
                   <w:rStyle w:val="Hyperlink"/>
@@ -7010,7 +7010,7 @@
             </w:tcMar>
           </w:tcPr>
           <w:p>
-            <w:hyperlink w:history="1" r:id="rIdg-qitit1c4jfgpdvxsmjp">
+            <w:hyperlink w:history="1" r:id="rIdulxutfnj_vk1apa5jubo9">
               <w:r>
                 <w:rPr>
                   <w:rStyle w:val="Hyperlink"/>
@@ -7481,7 +7481,7 @@
                 <w:sz w:val="19"/>
                 <w:szCs w:val="19"/>
               </w:rPr>
-              <w:t xml:space="preserve">Arduino Mega 2560 R3 정품 (A000067)</w:t>
+              <w:t xml:space="preserve">Arduino Mega 2560 R3 이탈리아 정품 (A000067)</w:t>
             </w:r>
           </w:p>
         </w:tc>
@@ -7508,7 +7508,7 @@
                 <w:sz w:val="19"/>
                 <w:szCs w:val="19"/>
               </w:rPr>
-              <w:t xml:space="preserve">[지원금 들어옴] 2번배 메인 제어기. RC 수신·ESC 신호·LED·비상정지 감지. 보유 1대는 1번배용</w:t>
+              <w:t xml:space="preserve">[지원금 들어옴] 2번배 메인 제어기. RC 수신·ESC 신호·LED·비상정지 감지. 보유 1대는 1번배용. 10-14 디바이스마트로 확정 — 컨버터·허브·퓨즈와 한 장바구니면 무료배송</w:t>
             </w:r>
           </w:p>
         </w:tc>
@@ -7568,7 +7568,7 @@
                 <w:sz w:val="19"/>
                 <w:szCs w:val="19"/>
               </w:rPr>
-              <w:t xml:space="preserve">58,000</w:t>
+              <w:t xml:space="preserve">64,900 (59,000+VAT)</w:t>
             </w:r>
           </w:p>
         </w:tc>
@@ -7622,7 +7622,7 @@
             </w:tcMar>
           </w:tcPr>
           <w:p>
-            <w:hyperlink w:history="1" r:id="rIdd1saj7-1hy5wgbo3memou">
+            <w:hyperlink w:history="1" r:id="rIdae6effptvu6jmgcaanrlo">
               <w:r>
                 <w:rPr>
                   <w:rStyle w:val="Hyperlink"/>
@@ -7632,7 +7632,7 @@
                   <w:szCs w:val="19"/>
                   <w:u w:val="single"/>
                 </w:rPr>
-                <w:t xml:space="preserve">다나와 검색</w:t>
+                <w:t xml:space="preserve">디바이스마트 no=34405</w:t>
               </w:r>
             </w:hyperlink>
           </w:p>
@@ -7754,7 +7754,7 @@
                 <w:sz w:val="19"/>
                 <w:szCs w:val="19"/>
               </w:rPr>
-              <w:t xml:space="preserve">58,000</w:t>
+              <w:t xml:space="preserve">64,900</w:t>
             </w:r>
           </w:p>
         </w:tc>
@@ -7892,7 +7892,7 @@
           <w:sz w:val="19"/>
           <w:szCs w:val="19"/>
         </w:rPr>
-        <w:t xml:space="preserve">디바이스마트 물건(컨버터·허브·퓨즈)은 한 번에 담는다. 약 47,000원이라 66,000원 무료배송선 미달, 배송비 2,700원.</w:t>
+        <w:t xml:space="preserve">디바이스마트 물건(컨버터·Mega·허브·퓨즈)은 한 번에 담는다. 126,600원이라 66,000원 넘겨 무료배송.</w:t>
       </w:r>
     </w:p>
     <w:p>
@@ -8793,7 +8793,7 @@
                 <w:sz w:val="24"/>
                 <w:szCs w:val="24"/>
               </w:rPr>
-              <w:t xml:space="preserve">1,689,920 ~ 1,704,920</w:t>
+              <w:t xml:space="preserve">1,696,820 ~ 1,711,820</w:t>
             </w:r>
           </w:p>
         </w:tc>
@@ -8884,7 +8884,7 @@
                 <w:sz w:val="24"/>
                 <w:szCs w:val="24"/>
               </w:rPr>
-              <w:t xml:space="preserve">1,407,200</w:t>
+              <w:t xml:space="preserve">1,414,100</w:t>
             </w:r>
           </w:p>
         </w:tc>
@@ -9297,7 +9297,7 @@
                 <w:sz w:val="19"/>
                 <w:szCs w:val="19"/>
               </w:rPr>
-              <w:t xml:space="preserve">58,000</w:t>
+              <w:t xml:space="preserve">64,900</w:t>
             </w:r>
           </w:p>
         </w:tc>
@@ -9329,7 +9329,7 @@
                 <w:sz w:val="19"/>
                 <w:szCs w:val="19"/>
               </w:rPr>
-              <w:t xml:space="preserve">계획서 3번 — 계획서는 2대, 필요 1대</w:t>
+              <w:t xml:space="preserve">계획서 3번 — 승인 119,200(2대) 안. 필요 1대</w:t>
             </w:r>
           </w:p>
         </w:tc>
@@ -9495,7 +9495,7 @@
                 <w:sz w:val="19"/>
                 <w:szCs w:val="19"/>
               </w:rPr>
-              <w:t xml:space="preserve">1,407,200</w:t>
+              <w:t xml:space="preserve">1,414,100</w:t>
             </w:r>
           </w:p>
         </w:tc>

</xml_diff>

<commit_message>
docs(구매): C(암)→A(수) 3.0 케이블 20cm ×2 추가 — NM-UCL02 가 C 플러그, 허브는 A 포트뿐. 폰용 OTG 는 반대 방향. 합계 1,710,420~1,725,420
Co-Authored-By: Claude Fable 5.1 <noreply@anthropic.com>
</commit_message>
<xml_diff>
--- a/docs/전달용/SSF2026_구매목록_계통별.docx
+++ b/docs/전달용/SSF2026_구매목록_계통별.docx
@@ -39,7 +39,7 @@
           <w:sz w:val="19"/>
           <w:szCs w:val="19"/>
         </w:rPr>
-        <w:t xml:space="preserve">사야 할 것은 11항목, 합계 약 170~171만원이다. 아직 하나도 주문하지 않았다. 같은 계통 안에서 하나만 빠져도 그 계통은 안 돈다.</w:t>
+        <w:t xml:space="preserve">사야 할 것은 12항목, 합계 약 171~173만원이다. 아직 하나도 주문하지 않았다. 같은 계통 안에서 하나만 빠져도 그 계통은 안 돈다.</w:t>
       </w:r>
     </w:p>
     <w:tbl>
@@ -250,7 +250,7 @@
                 <w:sz w:val="19"/>
                 <w:szCs w:val="19"/>
               </w:rPr>
-              <w:t xml:space="preserve">4</w:t>
+              <w:t xml:space="preserve">5</w:t>
             </w:r>
           </w:p>
         </w:tc>
@@ -282,7 +282,7 @@
                 <w:sz w:val="19"/>
                 <w:szCs w:val="19"/>
               </w:rPr>
-              <w:t xml:space="preserve">1,508,100</w:t>
+              <w:t xml:space="preserve">1,521,700</w:t>
             </w:r>
           </w:p>
         </w:tc>
@@ -314,7 +314,7 @@
                 <w:sz w:val="19"/>
                 <w:szCs w:val="19"/>
               </w:rPr>
-              <w:t xml:space="preserve">P0 카메라·인젝터·어댑터, P1 퓨즈</w:t>
+              <w:t xml:space="preserve">P0 카메라·인젝터·어댑터·젠더, P1 퓨즈</w:t>
             </w:r>
           </w:p>
         </w:tc>
@@ -1162,7 +1162,7 @@
                 <w:sz w:val="19"/>
                 <w:szCs w:val="19"/>
               </w:rPr>
-              <w:t xml:space="preserve">11</w:t>
+              <w:t xml:space="preserve">12</w:t>
             </w:r>
           </w:p>
         </w:tc>
@@ -1195,7 +1195,7 @@
                 <w:sz w:val="19"/>
                 <w:szCs w:val="19"/>
               </w:rPr>
-              <w:t xml:space="preserve">1,696,820 ~ 1,711,820</w:t>
+              <w:t xml:space="preserve">1,710,420 ~ 1,725,420</w:t>
             </w:r>
           </w:p>
         </w:tc>
@@ -1228,7 +1228,7 @@
                 <w:sz w:val="19"/>
                 <w:szCs w:val="19"/>
               </w:rPr>
-              <w:t xml:space="preserve">OAK 2대가 77~78%</w:t>
+              <w:t xml:space="preserve">OAK 2대가 77%</w:t>
             </w:r>
           </w:p>
         </w:tc>
@@ -2261,7 +2261,7 @@
                 <w:sz w:val="19"/>
                 <w:szCs w:val="19"/>
               </w:rPr>
-              <w:t xml:space="preserve">사진 2봉</w:t>
+              <w:t xml:space="preserve">사진 2봉 — C 플러그라 허브용 C→A 케이블 추가 주문(10-24)</w:t>
             </w:r>
           </w:p>
         </w:tc>
@@ -3886,7 +3886,7 @@
           <w:sz w:val="17"/>
           <w:szCs w:val="17"/>
         </w:rPr>
-        <w:t xml:space="preserve">배터리 ⊕ ─ 2A 퓨즈 ─▶ PoE 인젝터 ─ 동봉 2m Cat5e ─▶ OAK-1 PoE        인젝터 LAN ─▶ AX88179 어댑터 ─▶ 노트북</w:t>
+        <w:t xml:space="preserve">배터리 ⊕ ─ 2A 퓨즈 ─▶ PoE 인젝터 ─ 동봉 2m Cat5e ─▶ OAK-1 PoE      인젝터 LAN ─▶ NM-UCL02(C) ─ C암→A수 ─▶ UH308 허브 ─▶ 노트북</w:t>
       </w:r>
     </w:p>
     <w:tbl>
@@ -4267,7 +4267,7 @@
             </w:tcMar>
           </w:tcPr>
           <w:p>
-            <w:hyperlink w:history="1" r:id="rIdp_5glcvjmy_nqzmbbzqah">
+            <w:hyperlink w:history="1" r:id="rIdpilor9dsu2rr2wedi2ajc">
               <w:r>
                 <w:rPr>
                   <w:rStyle w:val="Hyperlink"/>
@@ -4450,7 +4450,7 @@
             </w:tcMar>
           </w:tcPr>
           <w:p>
-            <w:hyperlink w:history="1" r:id="rIdptd5uefpdtqnrkjkyzwhk">
+            <w:hyperlink w:history="1" r:id="rId2xol5ovsh2zfp4vt9kf4g">
               <w:r>
                 <w:rPr>
                   <w:rStyle w:val="Hyperlink"/>
@@ -4471,7 +4471,7 @@
               </w:rPr>
               <w:t xml:space="preserve"> · </w:t>
             </w:r>
-            <w:hyperlink w:history="1" r:id="rIdos2f0pyrrsa18k_ktavva">
+            <w:hyperlink w:history="1" r:id="rIdya239jsjyo5tikve8xmoh">
               <w:r>
                 <w:rPr>
                   <w:rStyle w:val="Hyperlink"/>
@@ -4654,7 +4654,7 @@
             </w:tcMar>
           </w:tcPr>
           <w:p>
-            <w:hyperlink w:history="1" r:id="rIdpujem9_leiqqecwfzpa33">
+            <w:hyperlink w:history="1" r:id="rId6c-1cdayv5wcm7kvk1iry">
               <w:r>
                 <w:rPr>
                   <w:rStyle w:val="Hyperlink"/>
@@ -4696,6 +4696,189 @@
                 <w:sz w:val="19"/>
                 <w:szCs w:val="19"/>
               </w:rPr>
+              <w:t xml:space="preserve">USB-C(암)→USB-A(수) 3.0 변환 케이블 20cm</w:t>
+            </w:r>
+          </w:p>
+        </w:tc>
+        <w:tc>
+          <w:tcPr>
+            <w:tcW w:type="dxa" w:w="4000"/>
+            <w:tcBorders>
+              <w:top w:val="single" w:color="A6A6A6" w:sz="4"/>
+              <w:left w:val="single" w:color="A6A6A6" w:sz="4"/>
+              <w:bottom w:val="single" w:color="A6A6A6" w:sz="4"/>
+              <w:right w:val="single" w:color="A6A6A6" w:sz="4"/>
+            </w:tcBorders>
+            <w:tcMar>
+              <w:top w:type="dxa" w:w="60"/>
+              <w:left w:type="dxa" w:w="100"/>
+              <w:bottom w:type="dxa" w:w="60"/>
+              <w:right w:type="dxa" w:w="100"/>
+            </w:tcMar>
+          </w:tcPr>
+          <w:p>
+            <w:r>
+              <w:rPr>
+                <w:rFonts w:ascii="Malgun Gothic" w:cs="Malgun Gothic" w:eastAsia="Malgun Gothic" w:hAnsi="Malgun Gothic"/>
+                <w:sz w:val="19"/>
+                <w:szCs w:val="19"/>
+              </w:rPr>
+              <w:t xml:space="preserve">NM-UCL02 가 C 플러그, 허브 UH308 은 A 포트뿐 → 사이에 끼운다. 노트북 USB 2개는 아두이노 직결·허브로 찼음. 폰용 OTG(C수→A암)는 반대 방향이라 불가</w:t>
+            </w:r>
+          </w:p>
+        </w:tc>
+        <w:tc>
+          <w:tcPr>
+            <w:tcW w:type="dxa" w:w="1100"/>
+            <w:tcBorders>
+              <w:top w:val="single" w:color="A6A6A6" w:sz="4"/>
+              <w:left w:val="single" w:color="A6A6A6" w:sz="4"/>
+              <w:bottom w:val="single" w:color="A6A6A6" w:sz="4"/>
+              <w:right w:val="single" w:color="A6A6A6" w:sz="4"/>
+            </w:tcBorders>
+            <w:tcMar>
+              <w:top w:type="dxa" w:w="60"/>
+              <w:left w:type="dxa" w:w="100"/>
+              <w:bottom w:type="dxa" w:w="60"/>
+              <w:right w:type="dxa" w:w="100"/>
+            </w:tcMar>
+          </w:tcPr>
+          <w:p>
+            <w:pPr>
+              <w:jc w:val="center"/>
+            </w:pPr>
+            <w:r>
+              <w:rPr>
+                <w:rFonts w:ascii="Malgun Gothic" w:cs="Malgun Gothic" w:eastAsia="Malgun Gothic" w:hAnsi="Malgun Gothic"/>
+                <w:sz w:val="19"/>
+                <w:szCs w:val="19"/>
+              </w:rPr>
+              <w:t xml:space="preserve">2</w:t>
+            </w:r>
+          </w:p>
+        </w:tc>
+        <w:tc>
+          <w:tcPr>
+            <w:tcW w:type="dxa" w:w="2300"/>
+            <w:tcBorders>
+              <w:top w:val="single" w:color="A6A6A6" w:sz="4"/>
+              <w:left w:val="single" w:color="A6A6A6" w:sz="4"/>
+              <w:bottom w:val="single" w:color="A6A6A6" w:sz="4"/>
+              <w:right w:val="single" w:color="A6A6A6" w:sz="4"/>
+            </w:tcBorders>
+            <w:tcMar>
+              <w:top w:type="dxa" w:w="60"/>
+              <w:left w:type="dxa" w:w="100"/>
+              <w:bottom w:type="dxa" w:w="60"/>
+              <w:right w:type="dxa" w:w="100"/>
+            </w:tcMar>
+          </w:tcPr>
+          <w:p>
+            <w:pPr>
+              <w:jc w:val="right"/>
+            </w:pPr>
+            <w:r>
+              <w:rPr>
+                <w:rFonts w:ascii="Malgun Gothic" w:cs="Malgun Gothic" w:eastAsia="Malgun Gothic" w:hAnsi="Malgun Gothic"/>
+                <w:sz w:val="19"/>
+                <w:szCs w:val="19"/>
+              </w:rPr>
+              <w:t xml:space="preserve">13,600 (개당 6,800)</w:t>
+            </w:r>
+          </w:p>
+        </w:tc>
+        <w:tc>
+          <w:tcPr>
+            <w:tcW w:type="dxa" w:w="700"/>
+            <w:tcBorders>
+              <w:top w:val="single" w:color="A6A6A6" w:sz="4"/>
+              <w:left w:val="single" w:color="A6A6A6" w:sz="4"/>
+              <w:bottom w:val="single" w:color="A6A6A6" w:sz="4"/>
+              <w:right w:val="single" w:color="A6A6A6" w:sz="4"/>
+            </w:tcBorders>
+            <w:tcMar>
+              <w:top w:type="dxa" w:w="60"/>
+              <w:left w:type="dxa" w:w="100"/>
+              <w:bottom w:type="dxa" w:w="60"/>
+              <w:right w:type="dxa" w:w="100"/>
+            </w:tcMar>
+          </w:tcPr>
+          <w:p>
+            <w:pPr>
+              <w:jc w:val="center"/>
+            </w:pPr>
+            <w:r>
+              <w:rPr>
+                <w:rFonts w:ascii="Malgun Gothic" w:cs="Malgun Gothic" w:eastAsia="Malgun Gothic" w:hAnsi="Malgun Gothic"/>
+                <w:b/>
+                <w:bCs/>
+                <w:color w:val="C00000"/>
+                <w:sz w:val="19"/>
+                <w:szCs w:val="19"/>
+              </w:rPr>
+              <w:t xml:space="preserve">P0</w:t>
+            </w:r>
+          </w:p>
+        </w:tc>
+        <w:tc>
+          <w:tcPr>
+            <w:tcW w:type="dxa" w:w="3470"/>
+            <w:tcBorders>
+              <w:top w:val="single" w:color="A6A6A6" w:sz="4"/>
+              <w:left w:val="single" w:color="A6A6A6" w:sz="4"/>
+              <w:bottom w:val="single" w:color="A6A6A6" w:sz="4"/>
+              <w:right w:val="single" w:color="A6A6A6" w:sz="4"/>
+            </w:tcBorders>
+            <w:tcMar>
+              <w:top w:type="dxa" w:w="60"/>
+              <w:left w:type="dxa" w:w="100"/>
+              <w:bottom w:type="dxa" w:w="60"/>
+              <w:right w:type="dxa" w:w="100"/>
+            </w:tcMar>
+          </w:tcPr>
+          <w:p>
+            <w:hyperlink w:history="1" r:id="rId-pybvqy8e5haj7bwlvrff">
+              <w:r>
+                <w:rPr>
+                  <w:rStyle w:val="Hyperlink"/>
+                  <w:rFonts w:ascii="Malgun Gothic" w:cs="Malgun Gothic" w:eastAsia="Malgun Gothic" w:hAnsi="Malgun Gothic"/>
+                  <w:color w:val="0563C1"/>
+                  <w:sz w:val="19"/>
+                  <w:szCs w:val="19"/>
+                  <w:u w:val="single"/>
+                </w:rPr>
+                <w:t xml:space="preserve">쿠팡</w:t>
+              </w:r>
+            </w:hyperlink>
+          </w:p>
+        </w:tc>
+      </w:tr>
+      <w:tr>
+        <w:tc>
+          <w:tcPr>
+            <w:tcW w:type="dxa" w:w="3000"/>
+            <w:tcBorders>
+              <w:top w:val="single" w:color="A6A6A6" w:sz="4"/>
+              <w:left w:val="single" w:color="A6A6A6" w:sz="4"/>
+              <w:bottom w:val="single" w:color="A6A6A6" w:sz="4"/>
+              <w:right w:val="single" w:color="A6A6A6" w:sz="4"/>
+            </w:tcBorders>
+            <w:tcMar>
+              <w:top w:type="dxa" w:w="60"/>
+              <w:left w:type="dxa" w:w="100"/>
+              <w:bottom w:type="dxa" w:w="60"/>
+              <w:right w:type="dxa" w:w="100"/>
+            </w:tcMar>
+          </w:tcPr>
+          <w:p>
+            <w:r>
+              <w:rPr>
+                <w:rFonts w:ascii="Malgun Gothic" w:cs="Malgun Gothic" w:eastAsia="Malgun Gothic" w:hAnsi="Malgun Gothic"/>
+                <w:b/>
+                <w:bCs/>
+                <w:sz w:val="19"/>
+                <w:szCs w:val="19"/>
+              </w:rPr>
               <w:t xml:space="preserve">퓨즈홀더 BF303 + 5x20 퓨즈 2A</w:t>
             </w:r>
           </w:p>
@@ -4837,7 +5020,7 @@
             </w:tcMar>
           </w:tcPr>
           <w:p>
-            <w:hyperlink w:history="1" r:id="rIdmobkfiu-9li-5kuyku5yu">
+            <w:hyperlink w:history="1" r:id="rId0wshwvpffqdmi2po0ae6l">
               <w:r>
                 <w:rPr>
                   <w:rStyle w:val="Hyperlink"/>
@@ -4858,7 +5041,7 @@
               </w:rPr>
               <w:t xml:space="preserve"> · </w:t>
             </w:r>
-            <w:hyperlink w:history="1" r:id="rIdygjccrkwt79y345wmzprr">
+            <w:hyperlink w:history="1" r:id="rIdgzlguwyzbiy1sxzjf7j1t">
               <w:r>
                 <w:rPr>
                   <w:rStyle w:val="Hyperlink"/>
@@ -4990,7 +5173,7 @@
                 <w:sz w:val="19"/>
                 <w:szCs w:val="19"/>
               </w:rPr>
-              <w:t xml:space="preserve">1,508,100</w:t>
+              <w:t xml:space="preserve">1,521,700</w:t>
             </w:r>
           </w:p>
         </w:tc>
@@ -7144,7 +7327,7 @@
             </w:tcMar>
           </w:tcPr>
           <w:p>
-            <w:hyperlink w:history="1" r:id="rIdggddwthksvwzd8kntc_hu">
+            <w:hyperlink w:history="1" r:id="rId3eozejyehrq9z4fg3gtjr">
               <w:r>
                 <w:rPr>
                   <w:rStyle w:val="Hyperlink"/>
@@ -7165,7 +7348,7 @@
               </w:rPr>
               <w:t xml:space="preserve"> · </w:t>
             </w:r>
-            <w:hyperlink w:history="1" r:id="rIdqhfmnb1w18ngjlm_xfu3d">
+            <w:hyperlink w:history="1" r:id="rIduvwosx-gi16svn8jn6r5p">
               <w:r>
                 <w:rPr>
                   <w:rStyle w:val="Hyperlink"/>
@@ -7802,7 +7985,7 @@
             </w:tcMar>
           </w:tcPr>
           <w:p>
-            <w:hyperlink w:history="1" r:id="rIdbis36fj7_oyu6hww1aop-">
+            <w:hyperlink w:history="1" r:id="rIdgtcx9fzxy7az2z6vvn8o8">
               <w:r>
                 <w:rPr>
                   <w:rStyle w:val="Hyperlink"/>
@@ -7985,7 +8168,7 @@
             </w:tcMar>
           </w:tcPr>
           <w:p>
-            <w:hyperlink w:history="1" r:id="rIdjcqyaifrjg5bazzc7pfev">
+            <w:hyperlink w:history="1" r:id="rIdin0qhh0qiryfygczoh-jn">
               <w:r>
                 <w:rPr>
                   <w:rStyle w:val="Hyperlink"/>
@@ -8597,7 +8780,7 @@
             </w:tcMar>
           </w:tcPr>
           <w:p>
-            <w:hyperlink w:history="1" r:id="rIdjehyze6x8gso8ilwqpgc7">
+            <w:hyperlink w:history="1" r:id="rIdjgatd4wkqvasxd99luome">
               <w:r>
                 <w:rPr>
                   <w:rStyle w:val="Hyperlink"/>
@@ -8618,7 +8801,7 @@
               </w:rPr>
               <w:t xml:space="preserve"> · </w:t>
             </w:r>
-            <w:hyperlink w:history="1" r:id="rIdhqbvsrvt9qtt-zqetcxv3">
+            <w:hyperlink w:history="1" r:id="rIdv2ftq0njqp9ytudgszyy8">
               <w:r>
                 <w:rPr>
                   <w:rStyle w:val="Hyperlink"/>
@@ -8801,7 +8984,7 @@
             </w:tcMar>
           </w:tcPr>
           <w:p>
-            <w:hyperlink w:history="1" r:id="rId0snfllxnrvvl0u2axjrmf">
+            <w:hyperlink w:history="1" r:id="rIdjm_canxrmzcgb313nm11h">
               <w:r>
                 <w:rPr>
                   <w:rStyle w:val="Hyperlink"/>
@@ -8822,7 +9005,7 @@
               </w:rPr>
               <w:t xml:space="preserve"> · </w:t>
             </w:r>
-            <w:hyperlink w:history="1" r:id="rIdl2qslsjb2rh-alms0zuit">
+            <w:hyperlink w:history="1" r:id="rId6kkaxtnwabrseg83bjfyv">
               <w:r>
                 <w:rPr>
                   <w:rStyle w:val="Hyperlink"/>
@@ -9005,7 +9188,7 @@
             </w:tcMar>
           </w:tcPr>
           <w:p>
-            <w:hyperlink w:history="1" r:id="rIdey60f_jx8arpylr7cpuf0">
+            <w:hyperlink w:history="1" r:id="rIdqo200azoa2kc5xnt2pezj">
               <w:r>
                 <w:rPr>
                   <w:rStyle w:val="Hyperlink"/>
@@ -9026,7 +9209,7 @@
               </w:rPr>
               <w:t xml:space="preserve"> · </w:t>
             </w:r>
-            <w:hyperlink w:history="1" r:id="rIdtqrmza3c01wx1_kfyuyn4">
+            <w:hyperlink w:history="1" r:id="rIdfkcpo3gmkvudtnkwzg53n">
               <w:r>
                 <w:rPr>
                   <w:rStyle w:val="Hyperlink"/>
@@ -9638,7 +9821,7 @@
             </w:tcMar>
           </w:tcPr>
           <w:p>
-            <w:hyperlink w:history="1" r:id="rIdcspndb8emqqdrrgypxw83">
+            <w:hyperlink w:history="1" r:id="rIda5zciliditezw6xeklxaj">
               <w:r>
                 <w:rPr>
                   <w:rStyle w:val="Hyperlink"/>
@@ -10250,7 +10433,7 @@
             </w:tcMar>
           </w:tcPr>
           <w:p>
-            <w:hyperlink w:history="1" r:id="rIdp4hyvtrnzguxg6tx2y2qt">
+            <w:hyperlink w:history="1" r:id="rId_zacj3uqtrxdohosj25b0">
               <w:r>
                 <w:rPr>
                   <w:rStyle w:val="Hyperlink"/>
@@ -11421,7 +11604,7 @@
                 <w:sz w:val="24"/>
                 <w:szCs w:val="24"/>
               </w:rPr>
-              <w:t xml:space="preserve">1,696,820 ~ 1,711,820</w:t>
+              <w:t xml:space="preserve">1,710,420 ~ 1,725,420</w:t>
             </w:r>
           </w:p>
         </w:tc>
@@ -11448,7 +11631,7 @@
                 <w:sz w:val="19"/>
                 <w:szCs w:val="19"/>
               </w:rPr>
-              <w:t xml:space="preserve">11항목 전체</w:t>
+              <w:t xml:space="preserve">12항목 전체</w:t>
             </w:r>
           </w:p>
         </w:tc>
@@ -11603,7 +11786,7 @@
                 <w:sz w:val="24"/>
                 <w:szCs w:val="24"/>
               </w:rPr>
-              <w:t xml:space="preserve">282,720 ~ 297,720</w:t>
+              <w:t xml:space="preserve">296,320 ~ 311,320</w:t>
             </w:r>
           </w:p>
         </w:tc>
@@ -11630,7 +11813,7 @@
                 <w:sz w:val="19"/>
                 <w:szCs w:val="19"/>
               </w:rPr>
-              <w:t xml:space="preserve">나머지 8항목 — 우리가 내야 하는 금액</w:t>
+              <w:t xml:space="preserve">나머지 9항목 — 우리가 내야 하는 금액</w:t>
             </w:r>
           </w:p>
         </w:tc>
@@ -12517,7 +12700,7 @@
                 <w:sz w:val="19"/>
                 <w:szCs w:val="19"/>
               </w:rPr>
-              <w:t xml:space="preserve">USB 3.0 C↔A 케이블 ×3</w:t>
+              <w:t xml:space="preserve">C암→A수 3.0 케이블 20cm ×2</w:t>
             </w:r>
           </w:p>
         </w:tc>
@@ -12549,7 +12732,7 @@
                 <w:sz w:val="19"/>
                 <w:szCs w:val="19"/>
               </w:rPr>
-              <w:t xml:space="preserve">15,000 ~ 30,000</w:t>
+              <w:t xml:space="preserve">13,600</w:t>
             </w:r>
           </w:p>
         </w:tc>
@@ -12581,7 +12764,7 @@
                 <w:sz w:val="19"/>
                 <w:szCs w:val="19"/>
               </w:rPr>
-              <w:t xml:space="preserve">B. D455</w:t>
+              <w:t xml:space="preserve">A. OAK 카메라</w:t>
             </w:r>
           </w:p>
         </w:tc>
@@ -12615,7 +12798,7 @@
                 <w:sz w:val="19"/>
                 <w:szCs w:val="19"/>
               </w:rPr>
-              <w:t xml:space="preserve">승압 컨버터 SZH-BPM001 ×2</w:t>
+              <w:t xml:space="preserve">USB 3.0 C↔A 케이블 ×3</w:t>
             </w:r>
           </w:p>
         </w:tc>
@@ -12647,7 +12830,7 @@
                 <w:sz w:val="19"/>
                 <w:szCs w:val="19"/>
               </w:rPr>
-              <w:t xml:space="preserve">26,400</w:t>
+              <w:t xml:space="preserve">15,000 ~ 30,000</w:t>
             </w:r>
           </w:p>
         </w:tc>
@@ -12679,7 +12862,7 @@
                 <w:sz w:val="19"/>
                 <w:szCs w:val="19"/>
               </w:rPr>
-              <w:t xml:space="preserve">D. 비상정지</w:t>
+              <w:t xml:space="preserve">B. D455</w:t>
             </w:r>
           </w:p>
         </w:tc>
@@ -12713,7 +12896,7 @@
                 <w:sz w:val="19"/>
                 <w:szCs w:val="19"/>
               </w:rPr>
-              <w:t xml:space="preserve">ipTIME UH308 허브 ×1</w:t>
+              <w:t xml:space="preserve">승압 컨버터 SZH-BPM001 ×2</w:t>
             </w:r>
           </w:p>
         </w:tc>
@@ -12745,7 +12928,7 @@
                 <w:sz w:val="19"/>
                 <w:szCs w:val="19"/>
               </w:rPr>
-              <w:t xml:space="preserve">27,900</w:t>
+              <w:t xml:space="preserve">26,400</w:t>
             </w:r>
           </w:p>
         </w:tc>
@@ -12777,7 +12960,7 @@
                 <w:sz w:val="19"/>
                 <w:szCs w:val="19"/>
               </w:rPr>
-              <w:t xml:space="preserve">E. USB 허브</w:t>
+              <w:t xml:space="preserve">D. 비상정지</w:t>
             </w:r>
           </w:p>
         </w:tc>
@@ -12811,7 +12994,7 @@
                 <w:sz w:val="19"/>
                 <w:szCs w:val="19"/>
               </w:rPr>
-              <w:t xml:space="preserve">5V 고정 강압 모듈 + DC잭 세트</w:t>
+              <w:t xml:space="preserve">ipTIME UH308 허브 ×1</w:t>
             </w:r>
           </w:p>
         </w:tc>
@@ -12843,7 +13026,7 @@
                 <w:sz w:val="19"/>
                 <w:szCs w:val="19"/>
               </w:rPr>
-              <w:t xml:space="preserve">14,620</w:t>
+              <w:t xml:space="preserve">27,900</w:t>
             </w:r>
           </w:p>
         </w:tc>
@@ -12909,7 +13092,7 @@
                 <w:sz w:val="19"/>
                 <w:szCs w:val="19"/>
               </w:rPr>
-              <w:t xml:space="preserve">퓨즈홀더 ×4 + 퓨즈 2A×10·3A×10</w:t>
+              <w:t xml:space="preserve">5V 고정 강압 모듈 + DC잭 세트</w:t>
             </w:r>
           </w:p>
         </w:tc>
@@ -12941,7 +13124,7 @@
                 <w:sz w:val="19"/>
                 <w:szCs w:val="19"/>
               </w:rPr>
-              <w:t xml:space="preserve">7,400</w:t>
+              <w:t xml:space="preserve">14,620</w:t>
             </w:r>
           </w:p>
         </w:tc>
@@ -12973,7 +13156,7 @@
                 <w:sz w:val="19"/>
                 <w:szCs w:val="19"/>
               </w:rPr>
-              <w:t xml:space="preserve">A·E</w:t>
+              <w:t xml:space="preserve">E. USB 허브</w:t>
             </w:r>
           </w:p>
         </w:tc>
@@ -13007,7 +13190,7 @@
                 <w:sz w:val="19"/>
                 <w:szCs w:val="19"/>
               </w:rPr>
-              <w:t xml:space="preserve">EC5 피그테일 ×3</w:t>
+              <w:t xml:space="preserve">퓨즈홀더 ×4 + 퓨즈 2A×10·3A×10</w:t>
             </w:r>
           </w:p>
         </w:tc>
@@ -13039,7 +13222,7 @@
                 <w:sz w:val="19"/>
                 <w:szCs w:val="19"/>
               </w:rPr>
-              <w:t xml:space="preserve">9,000</w:t>
+              <w:t xml:space="preserve">7,400</w:t>
             </w:r>
           </w:p>
         </w:tc>
@@ -13071,7 +13254,7 @@
                 <w:sz w:val="19"/>
                 <w:szCs w:val="19"/>
               </w:rPr>
-              <w:t xml:space="preserve">F. 주 전력</w:t>
+              <w:t xml:space="preserve">A·E</w:t>
             </w:r>
           </w:p>
         </w:tc>
@@ -13086,6 +13269,104 @@
               <w:bottom w:val="single" w:color="A6A6A6" w:sz="4"/>
               <w:right w:val="single" w:color="A6A6A6" w:sz="4"/>
             </w:tcBorders>
+            <w:tcMar>
+              <w:top w:type="dxa" w:w="60"/>
+              <w:left w:type="dxa" w:w="100"/>
+              <w:bottom w:type="dxa" w:w="60"/>
+              <w:right w:type="dxa" w:w="100"/>
+            </w:tcMar>
+          </w:tcPr>
+          <w:p>
+            <w:pPr>
+              <w:jc w:val="left"/>
+            </w:pPr>
+            <w:r>
+              <w:rPr>
+                <w:rFonts w:ascii="Malgun Gothic" w:cs="Malgun Gothic" w:eastAsia="Malgun Gothic" w:hAnsi="Malgun Gothic"/>
+                <w:b/>
+                <w:bCs/>
+                <w:sz w:val="19"/>
+                <w:szCs w:val="19"/>
+              </w:rPr>
+              <w:t xml:space="preserve">EC5 피그테일 ×3</w:t>
+            </w:r>
+          </w:p>
+        </w:tc>
+        <w:tc>
+          <w:tcPr>
+            <w:tcW w:type="dxa" w:w="3800"/>
+            <w:tcBorders>
+              <w:top w:val="single" w:color="A6A6A6" w:sz="4"/>
+              <w:left w:val="single" w:color="A6A6A6" w:sz="4"/>
+              <w:bottom w:val="single" w:color="A6A6A6" w:sz="4"/>
+              <w:right w:val="single" w:color="A6A6A6" w:sz="4"/>
+            </w:tcBorders>
+            <w:tcMar>
+              <w:top w:type="dxa" w:w="60"/>
+              <w:left w:type="dxa" w:w="100"/>
+              <w:bottom w:type="dxa" w:w="60"/>
+              <w:right w:type="dxa" w:w="100"/>
+            </w:tcMar>
+          </w:tcPr>
+          <w:p>
+            <w:pPr>
+              <w:jc w:val="right"/>
+            </w:pPr>
+            <w:r>
+              <w:rPr>
+                <w:rFonts w:ascii="Malgun Gothic" w:cs="Malgun Gothic" w:eastAsia="Malgun Gothic" w:hAnsi="Malgun Gothic"/>
+                <w:b w:val="false"/>
+                <w:bCs w:val="false"/>
+                <w:sz w:val="19"/>
+                <w:szCs w:val="19"/>
+              </w:rPr>
+              <w:t xml:space="preserve">9,000</w:t>
+            </w:r>
+          </w:p>
+        </w:tc>
+        <w:tc>
+          <w:tcPr>
+            <w:tcW w:type="dxa" w:w="6570"/>
+            <w:tcBorders>
+              <w:top w:val="single" w:color="A6A6A6" w:sz="4"/>
+              <w:left w:val="single" w:color="A6A6A6" w:sz="4"/>
+              <w:bottom w:val="single" w:color="A6A6A6" w:sz="4"/>
+              <w:right w:val="single" w:color="A6A6A6" w:sz="4"/>
+            </w:tcBorders>
+            <w:tcMar>
+              <w:top w:type="dxa" w:w="60"/>
+              <w:left w:type="dxa" w:w="100"/>
+              <w:bottom w:type="dxa" w:w="60"/>
+              <w:right w:type="dxa" w:w="100"/>
+            </w:tcMar>
+          </w:tcPr>
+          <w:p>
+            <w:pPr>
+              <w:jc w:val="left"/>
+            </w:pPr>
+            <w:r>
+              <w:rPr>
+                <w:rFonts w:ascii="Malgun Gothic" w:cs="Malgun Gothic" w:eastAsia="Malgun Gothic" w:hAnsi="Malgun Gothic"/>
+                <w:b w:val="false"/>
+                <w:bCs w:val="false"/>
+                <w:sz w:val="19"/>
+                <w:szCs w:val="19"/>
+              </w:rPr>
+              <w:t xml:space="preserve">F. 주 전력</w:t>
+            </w:r>
+          </w:p>
+        </w:tc>
+      </w:tr>
+      <w:tr>
+        <w:tc>
+          <w:tcPr>
+            <w:tcW w:type="dxa" w:w="4200"/>
+            <w:tcBorders>
+              <w:top w:val="single" w:color="A6A6A6" w:sz="4"/>
+              <w:left w:val="single" w:color="A6A6A6" w:sz="4"/>
+              <w:bottom w:val="single" w:color="A6A6A6" w:sz="4"/>
+              <w:right w:val="single" w:color="A6A6A6" w:sz="4"/>
+            </w:tcBorders>
             <w:shd w:fill="F2F2F2" w:color="auto" w:val="clear"/>
             <w:tcMar>
               <w:top w:type="dxa" w:w="60"/>
@@ -13139,7 +13420,7 @@
                 <w:sz w:val="19"/>
                 <w:szCs w:val="19"/>
               </w:rPr>
-              <w:t xml:space="preserve">282,720 ~ 297,720</w:t>
+              <w:t xml:space="preserve">296,320 ~ 311,320</w:t>
             </w:r>
           </w:p>
         </w:tc>

</xml_diff>